<commit_message>
docs: refine project_brief_final.docx layout, heading hierarchy, and list styles
</commit_message>
<xml_diff>
--- a/project_brief_final.docx
+++ b/project_brief_final.docx
@@ -459,21 +459,6 @@
         </w:tc>
       </w:tr>
     </w:tbl>
-    <w:p>
-      <w:pPr/>
-      <w:r>
-        <w:t xml:space="preserve">• </w:t>
-      </w:r>
-      <w:r>
-        <w:rPr>
-          <w:b/>
-        </w:rPr>
-        <w:t>Topik Proyek:</w:t>
-      </w:r>
-      <w:r>
-        <w:t xml:space="preserve"> Ketahanan Pangan &amp; Agrikultur Modern (Kategori: Urban Resilience &amp; Smart City)</w:t>
-      </w:r>
-    </w:p>
     <w:p xmlns:wp14="http://schemas.microsoft.com/office/word/2010/wordml" wp14:textId="77777777">
       <w:pPr>
         <w:pStyle w:val="Heading3"/>
@@ -527,7 +512,7 @@
     </w:p>
     <w:p>
       <w:pPr>
-        <w:pStyle w:val="Heading3"/>
+        <w:pStyle w:val="Heading4"/>
       </w:pPr>
       <w:r>
         <w:t>Latar Belakang Masalah</w:t>
@@ -549,102 +534,112 @@
       </w:r>
     </w:p>
     <w:p>
+      <w:pPr>
+        <w:pStyle w:val="ListParagraph"/>
+      </w:pPr>
+      <w:r>
+        <w:t xml:space="preserve">1. </w:t>
+      </w:r>
+      <w:r>
+        <w:rPr>
+          <w:b/>
+        </w:rPr>
+        <w:t>Lambatnya Integrasi Data:</w:t>
+      </w:r>
+      <w:r>
+        <w:t xml:space="preserve"> Proses pengumpulan data harga di pasar-pasar tradisional masih bersifat manual atau terpisah antara portal seperti PIHPS dan SP2KP, memicu jeda analisis hingga beberapa hari.</w:t>
+      </w:r>
+    </w:p>
+    <w:p>
+      <w:pPr>
+        <w:pStyle w:val="ListParagraph"/>
+      </w:pPr>
+      <w:r>
+        <w:t xml:space="preserve">2. </w:t>
+      </w:r>
+      <w:r>
+        <w:rPr>
+          <w:b/>
+        </w:rPr>
+        <w:t>Respons yang Bersifat Reaktif:</w:t>
+      </w:r>
+      <w:r>
+        <w:t xml:space="preserve"> Instansi pemerintah (TPID/Satgas Pangan) umumnya baru melakukan intervensi (seperti Operasi Pasar Murah) setelah harga pangan melambung tinggi di pasar konsumen (</w:t>
+      </w:r>
+      <w:r>
+        <w:rPr>
+          <w:i/>
+        </w:rPr>
+        <w:t>hilir</w:t>
+      </w:r>
+      <w:r>
+        <w:t>).</w:t>
+      </w:r>
+    </w:p>
+    <w:p>
+      <w:pPr>
+        <w:pStyle w:val="ListParagraph"/>
+      </w:pPr>
+      <w:r>
+        <w:t xml:space="preserve">3. </w:t>
+      </w:r>
+      <w:r>
+        <w:rPr>
+          <w:b/>
+        </w:rPr>
+        <w:t>Kebutaan Kalender (Calendar Blindness):</w:t>
+      </w:r>
+      <w:r>
+        <w:t xml:space="preserve"> Pemangku kebijakan tidak memiliki instrumen cerdas untuk memproyeksikan pergerakan harga komoditas pangan esensial ke depan berdasarkan siklus hari raya lokal keagamaan Islam (seperti Meugang dan Ramadan) yang tanggalnya selalu bergeser sekitar 11 hari setiap tahun Gregorian mengikuti kalender lunar Hijriah.</w:t>
+      </w:r>
+    </w:p>
+    <w:p>
+      <w:pPr>
+        <w:pStyle w:val="Heading4"/>
+      </w:pPr>
+      <w:r>
+        <w:t>Problem Statement</w:t>
+      </w:r>
+    </w:p>
+    <w:p>
       <w:pPr/>
       <w:r>
+        <w:t>Bagaimana membangun sistem otomatisasi terintegrasi yang mampu mengumpulkan data harga pangan harian secara serverless, mendeteksi anomali harga harian, dan meramal lonjakan harga 90 hari ke depan guna menyajikan rekomendasi kebijakan stabilisasi pasar secara preventif?</w:t>
+      </w:r>
+    </w:p>
+    <w:p>
+      <w:pPr>
+        <w:pStyle w:val="Heading4"/>
+      </w:pPr>
+      <w:r>
+        <w:t>Research Questions</w:t>
+      </w:r>
+    </w:p>
+    <w:p>
+      <w:pPr>
+        <w:pStyle w:val="ListParagraph"/>
+      </w:pPr>
+      <w:r>
         <w:t xml:space="preserve">1. </w:t>
       </w:r>
       <w:r>
-        <w:rPr>
-          <w:b/>
-        </w:rPr>
-        <w:t>Lambatnya Integrasi Data:</w:t>
-      </w:r>
-      <w:r>
-        <w:t xml:space="preserve"> Proses pengumpulan data harga di pasar-pasar tradisional masih bersifat manual atau terpisah antara portal seperti PIHPS dan SP2KP, memicu jeda analisis hingga beberapa hari.</w:t>
-      </w:r>
-    </w:p>
-    <w:p>
-      <w:pPr/>
+        <w:t>Komoditas apa saja yang saat ini menunjukkan anomali harga kritis di luar batas deviasi wajar ($2\sigma$ atau $3\sigma$) terhadap rata-rata bulanan (MA30)?</w:t>
+      </w:r>
+    </w:p>
+    <w:p>
+      <w:pPr>
+        <w:pStyle w:val="ListParagraph"/>
+      </w:pPr>
       <w:r>
         <w:t xml:space="preserve">2. </w:t>
       </w:r>
       <w:r>
-        <w:rPr>
-          <w:b/>
-        </w:rPr>
-        <w:t>Respons yang Bersifat Reaktif:</w:t>
-      </w:r>
-      <w:r>
-        <w:t xml:space="preserve"> Instansi pemerintah (TPID/Satgas Pangan) umumnya baru melakukan intervensi (seperti Operasi Pasar Murah) setelah harga pangan melambung tinggi di pasar konsumen (</w:t>
-      </w:r>
-      <w:r>
-        <w:rPr>
-          <w:i/>
-        </w:rPr>
-        <w:t>hilir</w:t>
-      </w:r>
-      <w:r>
-        <w:t>).</w:t>
-      </w:r>
-    </w:p>
-    <w:p>
-      <w:pPr/>
-      <w:r>
-        <w:t xml:space="preserve">3. </w:t>
-      </w:r>
-      <w:r>
-        <w:rPr>
-          <w:b/>
-        </w:rPr>
-        <w:t>Kebutaan Kalender (Calendar Blindness):</w:t>
-      </w:r>
-      <w:r>
-        <w:t xml:space="preserve"> Pemangku kebijakan tidak memiliki instrumen cerdas untuk memproyeksikan pergerakan harga komoditas pangan esensial ke depan berdasarkan siklus hari raya lokal keagamaan Islam (seperti Meugang dan Ramadan) yang tanggalnya selalu bergeser sekitar 11 hari setiap tahun Gregorian mengikuti kalender lunar Hijriah.</w:t>
-      </w:r>
-    </w:p>
-    <w:p>
-      <w:pPr>
-        <w:pStyle w:val="Heading3"/>
-      </w:pPr>
-      <w:r>
-        <w:t>Problem Statement</w:t>
-      </w:r>
-    </w:p>
-    <w:p>
-      <w:pPr/>
-      <w:r>
-        <w:t>Bagaimana membangun sistem otomatisasi terintegrasi yang mampu mengumpulkan data harga pangan harian secara serverless, mendeteksi anomali harga harian, dan meramal lonjakan harga 90 hari ke depan guna menyajikan rekomendasi kebijakan stabilisasi pasar secara preventif?</w:t>
-      </w:r>
-    </w:p>
-    <w:p>
-      <w:pPr>
-        <w:pStyle w:val="Heading3"/>
-      </w:pPr>
-      <w:r>
-        <w:t>Research Questions</w:t>
-      </w:r>
-    </w:p>
-    <w:p>
-      <w:pPr/>
-      <w:r>
-        <w:t xml:space="preserve">1. </w:t>
-      </w:r>
-      <w:r>
-        <w:t>Komoditas apa saja yang saat ini menunjukkan anomali harga kritis di luar batas deviasi wajar ($2\sigma$ atau $3\sigma$) terhadap rata-rata bulanan (MA30)?</w:t>
-      </w:r>
-    </w:p>
-    <w:p>
-      <w:pPr/>
-      <w:r>
-        <w:t xml:space="preserve">2. </w:t>
-      </w:r>
-      <w:r>
         <w:t>Komoditas apa saja yang diprediksi oleh Machine Learning akan mengalami lonjakan harga ekstrem ($\ge 20\%$) dalam 90 hari ke depan?</w:t>
       </w:r>
     </w:p>
     <w:p>
       <w:pPr>
-        <w:pStyle w:val="Heading3"/>
+        <w:pStyle w:val="Heading4"/>
       </w:pPr>
       <w:r>
         <w:t>Mengapa Memilih Proyek Ini (Painkiller Concept)</w:t>
@@ -706,7 +701,7 @@
     </w:p>
     <w:p>
       <w:pPr>
-        <w:pStyle w:val="Heading3"/>
+        <w:pStyle w:val="Heading4"/>
       </w:pPr>
       <w:r>
         <w:t>Solusi yang Ditawarkan</w:t>
@@ -720,14 +715,16 @@
     </w:p>
     <w:p>
       <w:pPr>
-        <w:pStyle w:val="Heading3"/>
+        <w:pStyle w:val="Heading4"/>
       </w:pPr>
       <w:r>
         <w:t>Nama Produk, Fungsi, &amp; Penyelesaian Masalah</w:t>
       </w:r>
     </w:p>
     <w:p>
-      <w:pPr/>
+      <w:pPr>
+        <w:pStyle w:val="ListParagraph"/>
+      </w:pPr>
       <w:r>
         <w:t xml:space="preserve">• </w:t>
       </w:r>
@@ -742,7 +739,9 @@
       </w:r>
     </w:p>
     <w:p>
-      <w:pPr/>
+      <w:pPr>
+        <w:pStyle w:val="ListParagraph"/>
+      </w:pPr>
       <w:r>
         <w:t xml:space="preserve">• </w:t>
       </w:r>
@@ -757,7 +756,9 @@
       </w:r>
     </w:p>
     <w:p>
-      <w:pPr/>
+      <w:pPr>
+        <w:pStyle w:val="ListParagraph"/>
+      </w:pPr>
       <w:r>
         <w:t xml:space="preserve">• </w:t>
       </w:r>
@@ -804,270 +805,290 @@
     </w:p>
     <w:p>
       <w:pPr>
-        <w:pStyle w:val="Heading3"/>
+        <w:pStyle w:val="Heading4"/>
       </w:pPr>
       <w:r>
         <w:t>Fitur Utama Produk</w:t>
       </w:r>
     </w:p>
     <w:p>
+      <w:pPr>
+        <w:pStyle w:val="ListParagraph"/>
+      </w:pPr>
+      <w:r>
+        <w:t xml:space="preserve">• </w:t>
+      </w:r>
+      <w:r>
+        <w:rPr>
+          <w:b/>
+        </w:rPr>
+        <w:t>Predictive EWS Cards:</w:t>
+      </w:r>
+      <w:r>
+        <w:t xml:space="preserve"> Menyoroti 3 komoditas paling rentan mengalami lonjakan harga ekstrem dalam 90 hari ke depan dengan label status bahaya otomatis.</w:t>
+      </w:r>
+    </w:p>
+    <w:p>
+      <w:pPr>
+        <w:pStyle w:val="ListParagraph"/>
+      </w:pPr>
+      <w:r>
+        <w:t xml:space="preserve">• </w:t>
+      </w:r>
+      <w:r>
+        <w:rPr>
+          <w:b/>
+        </w:rPr>
+        <w:t>Actionable AI Insights (Meta Prophet):</w:t>
+      </w:r>
+      <w:r>
+        <w:t xml:space="preserve"> Menyajikan hasil peramalan deret waktu 90 hari ke depan yang dilengkapi dengan visualisasi batas atas keyakinan (</w:t>
+      </w:r>
+      <w:r>
+        <w:rPr>
+          <w:rFonts w:ascii="Courier New" w:hAnsi="Courier New"/>
+        </w:rPr>
+        <w:t>yhat_upper</w:t>
+      </w:r>
+      <w:r>
+        <w:t>) untuk skenario terburuk (</w:t>
+      </w:r>
+      <w:r>
+        <w:rPr>
+          <w:i/>
+        </w:rPr>
+        <w:t>worst-case scenario</w:t>
+      </w:r>
+      <w:r>
+        <w:t>).</w:t>
+      </w:r>
+    </w:p>
+    <w:p>
+      <w:pPr>
+        <w:pStyle w:val="ListParagraph"/>
+      </w:pPr>
+      <w:r>
+        <w:t xml:space="preserve">• </w:t>
+      </w:r>
+      <w:r>
+        <w:rPr>
+          <w:b/>
+        </w:rPr>
+        <w:t>Process Control Anomaly Detection:</w:t>
+      </w:r>
+      <w:r>
+        <w:t xml:space="preserve"> Menghitung deviasi harga harian terhadap rata-rata bulanan menggunakan batas Z-Score dinamis ($2\sigma$ untuk waspada, $3\sigma$ untuk kritis).</w:t>
+      </w:r>
+    </w:p>
+    <w:p>
+      <w:pPr>
+        <w:pStyle w:val="ListParagraph"/>
+      </w:pPr>
+      <w:r>
+        <w:t xml:space="preserve">• </w:t>
+      </w:r>
+      <w:r>
+        <w:rPr>
+          <w:b/>
+        </w:rPr>
+        <w:t>Audit Rantai Pasokan (Margin Audit):</w:t>
+      </w:r>
+      <w:r>
+        <w:t xml:space="preserve"> Diagram alur interaktif yang membandingkan harga dari tingkat Produsen $\rightarrow$ Pedagang Besar $\rightarrow$ Pasar Tradisional $\rightarrow$ Pasar Modern untuk mendeteksi indikasi spekulan.</w:t>
+      </w:r>
+    </w:p>
+    <w:p>
+      <w:pPr>
+        <w:pStyle w:val="ListParagraph"/>
+      </w:pPr>
+      <w:r>
+        <w:t xml:space="preserve">• </w:t>
+      </w:r>
+      <w:r>
+        <w:rPr>
+          <w:b/>
+        </w:rPr>
+        <w:t>Automated Telegram Alerts:</w:t>
+      </w:r>
+      <w:r>
+        <w:t xml:space="preserve"> Pengiriman pesan ringkasan anomali kritis dan prediksi spike harga harian langsung ke Telegram grup Satgas Pangan pada pukul 08:00 WIB.</w:t>
+      </w:r>
+    </w:p>
+    <w:p>
+      <w:pPr>
+        <w:pStyle w:val="ListParagraph"/>
+      </w:pPr>
+      <w:r>
+        <w:t xml:space="preserve">• </w:t>
+      </w:r>
+      <w:r>
+        <w:rPr>
+          <w:b/>
+        </w:rPr>
+        <w:t>Fallback Protocol (Safety Net):</w:t>
+      </w:r>
+      <w:r>
+        <w:t xml:space="preserve"> Pengaktifan protokol mitigasi otomatis untuk komoditas volatilitas tinggi (MAPE &gt; 15%) dengan mengabaikan ramalan titik tunggal dan berfokus pada visualisasi </w:t>
+      </w:r>
+      <w:r>
+        <w:rPr>
+          <w:rFonts w:ascii="Courier New" w:hAnsi="Courier New"/>
+        </w:rPr>
+        <w:t>yhat_upper</w:t>
+      </w:r>
+      <w:r>
+        <w:t>.</w:t>
+      </w:r>
+    </w:p>
+    <w:p>
+      <w:pPr>
+        <w:pStyle w:val="Heading4"/>
+      </w:pPr>
+      <w:r>
+        <w:t>Teknologi dan Tools yang Digunakan</w:t>
+      </w:r>
+    </w:p>
+    <w:p>
+      <w:pPr>
+        <w:pStyle w:val="ListParagraph"/>
+      </w:pPr>
+      <w:r>
+        <w:t xml:space="preserve">• </w:t>
+      </w:r>
+      <w:r>
+        <w:rPr>
+          <w:b/>
+        </w:rPr>
+        <w:t>Bahasa Pemrograman:</w:t>
+      </w:r>
+      <w:r>
+        <w:t xml:space="preserve"> Python 3.11 (Backend &amp; ML Pipeline), JavaScript (Dasbor Frontend).</w:t>
+      </w:r>
+    </w:p>
+    <w:p>
+      <w:pPr>
+        <w:pStyle w:val="ListParagraph"/>
+      </w:pPr>
+      <w:r>
+        <w:t xml:space="preserve">• </w:t>
+      </w:r>
+      <w:r>
+        <w:rPr>
+          <w:b/>
+        </w:rPr>
+        <w:t>Visualisasi Frontend:</w:t>
+      </w:r>
+      <w:r>
+        <w:t xml:space="preserve"> Vanilla HTML/CSS (Desain Dark Glassmorphism), Chart.js (Grafik Tren &amp; Prediksi Interaktif), Leaflet.js (Peta Anomali Spasial).</w:t>
+      </w:r>
+    </w:p>
+    <w:p>
+      <w:pPr>
+        <w:pStyle w:val="ListParagraph"/>
+      </w:pPr>
+      <w:r>
+        <w:t xml:space="preserve">• </w:t>
+      </w:r>
+      <w:r>
+        <w:rPr>
+          <w:b/>
+        </w:rPr>
+        <w:t>Machine Learning &amp; Analytics:</w:t>
+      </w:r>
+      <w:r>
+        <w:t xml:space="preserve"> Meta Prophet (Forecasting Engine), Scipy Stats (Pengujian Hipotesis Statistik), Pandas &amp; NumPy (Data Processing).</w:t>
+      </w:r>
+    </w:p>
+    <w:p>
+      <w:pPr>
+        <w:pStyle w:val="ListParagraph"/>
+      </w:pPr>
+      <w:r>
+        <w:t xml:space="preserve">• </w:t>
+      </w:r>
+      <w:r>
+        <w:rPr>
+          <w:b/>
+        </w:rPr>
+        <w:t>Otomasi CLI Lokal:</w:t>
+      </w:r>
+      <w:r>
+        <w:t xml:space="preserve"> GNU Makefile &amp; Environment Localizer (.env) untuk memisahkan rahasia.</w:t>
+      </w:r>
+    </w:p>
+    <w:p>
+      <w:pPr>
+        <w:pStyle w:val="Heading4"/>
+      </w:pPr>
+      <w:r>
+        <w:t>Arsitektur Sistem &amp; Data Pipeline</w:t>
+      </w:r>
+    </w:p>
+    <w:p>
       <w:pPr/>
       <w:r>
-        <w:t xml:space="preserve">• </w:t>
-      </w:r>
-      <w:r>
-        <w:rPr>
-          <w:b/>
-        </w:rPr>
-        <w:t>Predictive EWS Cards:</w:t>
-      </w:r>
-      <w:r>
-        <w:t xml:space="preserve"> Menyoroti 3 komoditas paling rentan mengalami lonjakan harga ekstrem dalam 90 hari ke depan dengan label status bahaya otomatis.</w:t>
+        <w:t>Aliran data ARM dirancang secara serverless untuk menghindari kerumitan pemeliharaan server fisik (</w:t>
+      </w:r>
+      <w:r>
+        <w:rPr>
+          <w:i/>
+        </w:rPr>
+        <w:t>zero-maintenance infrastructure</w:t>
+      </w:r>
+      <w:r>
+        <w:t>):</w:t>
       </w:r>
     </w:p>
     <w:p>
       <w:pPr/>
       <w:r>
-        <w:t xml:space="preserve">• </w:t>
-      </w:r>
-      <w:r>
-        <w:rPr>
-          <w:b/>
-        </w:rPr>
-        <w:t>Actionable AI Insights (Meta Prophet):</w:t>
-      </w:r>
-      <w:r>
-        <w:t xml:space="preserve"> Menyajikan hasil peramalan deret waktu 90 hari ke depan yang dilengkapi dengan visualisasi batas atas keyakinan (</w:t>
-      </w:r>
-      <w:r>
         <w:rPr>
           <w:rFonts w:ascii="Courier New" w:hAnsi="Courier New"/>
         </w:rPr>
-        <w:t>yhat_upper</w:t>
-      </w:r>
-      <w:r>
-        <w:t>) untuk skenario terburuk (</w:t>
-      </w:r>
-      <w:r>
-        <w:rPr>
-          <w:i/>
-        </w:rPr>
-        <w:t>worst-case scenario</w:t>
-      </w:r>
-      <w:r>
-        <w:t>).</w:t>
+      </w:r>
+      <w:r>
+        <w:t>`mermaid flowchart TB subgraph INGESTION ["📥 Ingestion &amp; In-Memory ETL"] A1["🌐 PIHPS Web Scraper"] --&gt;|daily update| B1["Azure Blob Storage&lt;br/&gt;(arm-raw-data)"] B1 --&gt;|combine in memory| C1["scripts/etl.py&lt;br/&gt;load_all_data() + add_holiday_features()"] end</w:t>
       </w:r>
     </w:p>
     <w:p>
       <w:pPr/>
       <w:r>
-        <w:t xml:space="preserve">• </w:t>
-      </w:r>
-      <w:r>
-        <w:rPr>
-          <w:b/>
-        </w:rPr>
-        <w:t>Process Control Anomaly Detection:</w:t>
-      </w:r>
-      <w:r>
-        <w:t xml:space="preserve"> Menghitung deviasi harga harian terhadap rata-rata bulanan menggunakan batas Z-Score dinamis ($2\sigma$ untuk waspada, $3\sigma$ untuk kritis).</w:t>
+        <w:t>subgraph ANALYTICS ["🧠 In-Memory Processing &amp; MLOps"] C1 --&gt; D1["scripts/anomaly.py&lt;br/&gt;Z-Score + MA30"] C1 --&gt; D2["scripts/forecast.py&lt;br/&gt;84 Prophet Models (RAM)"] D2 --&gt;|Log metrics harian| E1["Azure ML Studio&lt;br/&gt;(MLflow API)"] end</w:t>
       </w:r>
     </w:p>
     <w:p>
       <w:pPr/>
       <w:r>
-        <w:t xml:space="preserve">• </w:t>
-      </w:r>
-      <w:r>
-        <w:rPr>
-          <w:b/>
-        </w:rPr>
-        <w:t>Audit Rantai Pasokan (Margin Audit):</w:t>
-      </w:r>
-      <w:r>
-        <w:t xml:space="preserve"> Diagram alur interaktif yang membandingkan harga dari tingkat Produsen $\rightarrow$ Pedagang Besar $\rightarrow$ Pasar Tradisional $\rightarrow$ Pasar Modern untuk mendeteksi indikasi spekulan.</w:t>
+        <w:t>subgraph OUTPUT ["📤 serve layer"] D1 &amp; D2 --&gt; F1["prepare_dashboard_data.py&lt;br/&gt;(Resampling &amp; JSON Compression)"] F1 --&gt;|upload dashboard_data.json| G1["Azure Blob Storage&lt;br/&gt;($web container)"] F1 --&gt;|If anomaly / EWS spike| H1["Telegram Bot API&lt;br/&gt;(Satgas Pangan Alerts)"] end</w:t>
       </w:r>
     </w:p>
     <w:p>
       <w:pPr/>
       <w:r>
-        <w:t xml:space="preserve">• </w:t>
-      </w:r>
-      <w:r>
-        <w:rPr>
-          <w:b/>
-        </w:rPr>
-        <w:t>Automated Telegram Alerts:</w:t>
-      </w:r>
-      <w:r>
-        <w:t xml:space="preserve"> Pengiriman pesan ringkasan anomali kritis dan prediksi spike harga harian langsung ke Telegram grup Satgas Pangan pada pukul 08:00 WIB.</w:t>
+        <w:t xml:space="preserve">subgraph CONSUMER ["🌐 End-User Interaction"] G1 --&gt; I1["Azure Static Web Apps&lt;br/&gt;(CORS configured)"] I1 --&gt; J1["📊 Web Dashboard&lt;br/&gt;(Client-side Chart.js)"] end </w:t>
+      </w:r>
+      <w:r>
+        <w:rPr>
+          <w:rFonts w:ascii="Courier New" w:hAnsi="Courier New"/>
+        </w:rPr>
+      </w:r>
+      <w:r>
+        <w:rPr>
+          <w:rFonts w:ascii="Courier New" w:hAnsi="Courier New"/>
+        </w:rPr>
+      </w:r>
+    </w:p>
+    <w:p>
+      <w:pPr>
+        <w:pStyle w:val="Heading4"/>
+      </w:pPr>
+      <w:r>
+        <w:t>Perbandingan Model Baseline (Benchmark)</w:t>
       </w:r>
     </w:p>
     <w:p>
       <w:pPr/>
       <w:r>
-        <w:t xml:space="preserve">• </w:t>
-      </w:r>
-      <w:r>
-        <w:rPr>
-          <w:b/>
-        </w:rPr>
-        <w:t>Fallback Protocol (Safety Net):</w:t>
-      </w:r>
-      <w:r>
-        <w:t xml:space="preserve"> Pengaktifan protokol mitigasi otomatis untuk komoditas volatilitas tinggi (MAPE &gt; 15%) dengan mengabaikan ramalan titik tunggal dan berfokus pada visualisasi </w:t>
-      </w:r>
-      <w:r>
-        <w:rPr>
-          <w:rFonts w:ascii="Courier New" w:hAnsi="Courier New"/>
-        </w:rPr>
-        <w:t>yhat_upper</w:t>
-      </w:r>
-      <w:r>
-        <w:t>.</w:t>
-      </w:r>
-    </w:p>
-    <w:p>
-      <w:pPr>
-        <w:pStyle w:val="Heading3"/>
-      </w:pPr>
-      <w:r>
-        <w:t>Teknologi dan Tools yang Digunakan</w:t>
-      </w:r>
-    </w:p>
-    <w:p>
-      <w:pPr/>
-      <w:r>
-        <w:t xml:space="preserve">• </w:t>
-      </w:r>
-      <w:r>
-        <w:rPr>
-          <w:b/>
-        </w:rPr>
-        <w:t>Bahasa Pemrograman:</w:t>
-      </w:r>
-      <w:r>
-        <w:t xml:space="preserve"> Python 3.11 (Backend &amp; ML Pipeline), JavaScript (Dasbor Frontend).</w:t>
-      </w:r>
-    </w:p>
-    <w:p>
-      <w:pPr/>
-      <w:r>
-        <w:t xml:space="preserve">• </w:t>
-      </w:r>
-      <w:r>
-        <w:rPr>
-          <w:b/>
-        </w:rPr>
-        <w:t>Visualisasi Frontend:</w:t>
-      </w:r>
-      <w:r>
-        <w:t xml:space="preserve"> Vanilla HTML/CSS (Desain Dark Glassmorphism), Chart.js (Grafik Tren &amp; Prediksi Interaktif), Leaflet.js (Peta Anomali Spasial).</w:t>
-      </w:r>
-    </w:p>
-    <w:p>
-      <w:pPr/>
-      <w:r>
-        <w:t xml:space="preserve">• </w:t>
-      </w:r>
-      <w:r>
-        <w:rPr>
-          <w:b/>
-        </w:rPr>
-        <w:t>Machine Learning &amp; Analytics:</w:t>
-      </w:r>
-      <w:r>
-        <w:t xml:space="preserve"> Meta Prophet (Forecasting Engine), Scipy Stats (Pengujian Hipotesis Statistik), Pandas &amp; NumPy (Data Processing).</w:t>
-      </w:r>
-    </w:p>
-    <w:p>
-      <w:pPr/>
-      <w:r>
-        <w:t xml:space="preserve">• </w:t>
-      </w:r>
-      <w:r>
-        <w:rPr>
-          <w:b/>
-        </w:rPr>
-        <w:t>Otomasi CLI Lokal:</w:t>
-      </w:r>
-      <w:r>
-        <w:t xml:space="preserve"> GNU Makefile &amp; Environment Localizer (.env) untuk memisahkan rahasia.</w:t>
-      </w:r>
-    </w:p>
-    <w:p>
-      <w:pPr>
-        <w:pStyle w:val="Heading3"/>
-      </w:pPr>
-      <w:r>
-        <w:t>Arsitektur Sistem &amp; Data Pipeline</w:t>
-      </w:r>
-    </w:p>
-    <w:p>
-      <w:pPr/>
-      <w:r>
-        <w:t>Aliran data ARM dirancang secara serverless untuk menghindari kerumitan pemeliharaan server fisik (</w:t>
-      </w:r>
-      <w:r>
-        <w:rPr>
-          <w:i/>
-        </w:rPr>
-        <w:t>zero-maintenance infrastructure</w:t>
-      </w:r>
-      <w:r>
-        <w:t>):</w:t>
-      </w:r>
-    </w:p>
-    <w:p>
-      <w:pPr/>
-      <w:r>
-        <w:rPr>
-          <w:rFonts w:ascii="Courier New" w:hAnsi="Courier New"/>
-        </w:rPr>
-      </w:r>
-      <w:r>
-        <w:t>`mermaid flowchart TB subgraph INGESTION ["📥 Ingestion &amp; In-Memory ETL"] A1["🌐 PIHPS Web Scraper"] --&gt;|daily update| B1["Azure Blob Storage&lt;br/&gt;(arm-raw-data)"] B1 --&gt;|combine in memory| C1["scripts/etl.py&lt;br/&gt;load_all_data() + add_holiday_features()"] end</w:t>
-      </w:r>
-    </w:p>
-    <w:p>
-      <w:pPr/>
-      <w:r>
-        <w:t>subgraph ANALYTICS ["🧠 In-Memory Processing &amp; MLOps"] C1 --&gt; D1["scripts/anomaly.py&lt;br/&gt;Z-Score + MA30"] C1 --&gt; D2["scripts/forecast.py&lt;br/&gt;84 Prophet Models (RAM)"] D2 --&gt;|Log metrics harian| E1["Azure ML Studio&lt;br/&gt;(MLflow API)"] end</w:t>
-      </w:r>
-    </w:p>
-    <w:p>
-      <w:pPr/>
-      <w:r>
-        <w:t>subgraph OUTPUT ["📤 serve layer"] D1 &amp; D2 --&gt; F1["prepare_dashboard_data.py&lt;br/&gt;(Resampling &amp; JSON Compression)"] F1 --&gt;|upload dashboard_data.json| G1["Azure Blob Storage&lt;br/&gt;($web container)"] F1 --&gt;|If anomaly / EWS spike| H1["Telegram Bot API&lt;br/&gt;(Satgas Pangan Alerts)"] end</w:t>
-      </w:r>
-    </w:p>
-    <w:p>
-      <w:pPr/>
-      <w:r>
-        <w:t xml:space="preserve">subgraph CONSUMER ["🌐 End-User Interaction"] G1 --&gt; I1["Azure Static Web Apps&lt;br/&gt;(CORS configured)"] I1 --&gt; J1["📊 Web Dashboard&lt;br/&gt;(Client-side Chart.js)"] end </w:t>
-      </w:r>
-      <w:r>
-        <w:rPr>
-          <w:rFonts w:ascii="Courier New" w:hAnsi="Courier New"/>
-        </w:rPr>
-      </w:r>
-      <w:r>
-        <w:rPr>
-          <w:rFonts w:ascii="Courier New" w:hAnsi="Courier New"/>
-        </w:rPr>
-      </w:r>
-    </w:p>
-    <w:p>
-      <w:pPr>
-        <w:pStyle w:val="Heading3"/>
-      </w:pPr>
-      <w:r>
-        <w:t>Perbandingan Model Baseline (Benchmark)</w:t>
-      </w:r>
-    </w:p>
-    <w:p>
-      <w:pPr/>
-      <w:r>
         <w:t xml:space="preserve">Untuk memvalidasi keunggulan algoritma </w:t>
       </w:r>
       <w:r>
@@ -1081,7 +1102,9 @@
       </w:r>
     </w:p>
     <w:p>
-      <w:pPr/>
+      <w:pPr>
+        <w:pStyle w:val="ListParagraph"/>
+      </w:pPr>
       <w:r>
         <w:t xml:space="preserve">1. </w:t>
       </w:r>
@@ -1096,7 +1119,9 @@
       </w:r>
     </w:p>
     <w:p>
-      <w:pPr/>
+      <w:pPr>
+        <w:pStyle w:val="ListParagraph"/>
+      </w:pPr>
       <w:r>
         <w:t xml:space="preserve">2. </w:t>
       </w:r>
@@ -1111,7 +1136,9 @@
       </w:r>
     </w:p>
     <w:p>
-      <w:pPr/>
+      <w:pPr>
+        <w:pStyle w:val="ListParagraph"/>
+      </w:pPr>
       <w:r>
         <w:t xml:space="preserve">3. </w:t>
       </w:r>
@@ -1127,7 +1154,7 @@
     </w:p>
     <w:p>
       <w:pPr>
-        <w:pStyle w:val="Heading4"/>
+        <w:pStyle w:val="Heading5"/>
       </w:pPr>
       <w:r>
         <w:t>Tabel Komparasi MAPE (%) Evaluasi Akhir</w:t>
@@ -2655,7 +2682,7 @@
     </w:tbl>
     <w:p>
       <w:pPr>
-        <w:pStyle w:val="Heading4"/>
+        <w:pStyle w:val="Heading5"/>
       </w:pPr>
       <w:r>
         <w:t>Defensibilitas Model &amp; Bahaya Time-Lag Moving Average</w:t>
@@ -2773,953 +2800,1009 @@
     </w:p>
     <w:p>
       <w:pPr>
-        <w:pStyle w:val="Heading3"/>
+        <w:pStyle w:val="Heading4"/>
       </w:pPr>
       <w:r>
         <w:t>1. Azure Services yang Digunakan &amp; Konfigurasi Teknis</w:t>
       </w:r>
     </w:p>
     <w:p>
+      <w:pPr>
+        <w:pStyle w:val="ListParagraph"/>
+      </w:pPr>
+      <w:r>
+        <w:t xml:space="preserve">• </w:t>
+      </w:r>
+      <w:r>
+        <w:rPr>
+          <w:b/>
+        </w:rPr>
+        <w:t>Azure Blob Storage (Data Lake &amp; Static Content Hosting):</w:t>
+      </w:r>
+    </w:p>
+    <w:p>
+      <w:pPr>
+        <w:pStyle w:val="ListParagraph"/>
+      </w:pPr>
+      <w:r>
+        <w:t xml:space="preserve">• </w:t>
+      </w:r>
+      <w:r>
+        <w:rPr>
+          <w:i/>
+        </w:rPr>
+        <w:t>Data Lake Privat (`arm-raw-data`)</w:t>
+      </w:r>
+      <w:r>
+        <w:t>: Menyimpan data historis tahunan harga pangan (</w:t>
+      </w:r>
+      <w:r>
+        <w:rPr>
+          <w:rFonts w:ascii="Courier New" w:hAnsi="Courier New"/>
+        </w:rPr>
+        <w:t>2021.json</w:t>
+      </w:r>
+      <w:r>
+        <w:t xml:space="preserve"> s/d </w:t>
+      </w:r>
+      <w:r>
+        <w:rPr>
+          <w:rFonts w:ascii="Courier New" w:hAnsi="Courier New"/>
+        </w:rPr>
+        <w:t>2026.json</w:t>
+      </w:r>
+      <w:r>
+        <w:t>) dalam level granular 2 (sub-komoditas). Folder diatur secara privat untuk mencegah kebocoran data hulu.</w:t>
+      </w:r>
+    </w:p>
+    <w:p>
+      <w:pPr>
+        <w:pStyle w:val="ListParagraph"/>
+      </w:pPr>
+      <w:r>
+        <w:t xml:space="preserve">• </w:t>
+      </w:r>
+      <w:r>
+        <w:rPr>
+          <w:i/>
+        </w:rPr>
+        <w:t>Web Feed Container (`$web`)</w:t>
+      </w:r>
+      <w:r>
+        <w:t xml:space="preserve">: Menyimpan file hasil agregasi terkompresi </w:t>
+      </w:r>
+      <w:r>
+        <w:rPr>
+          <w:rFonts w:ascii="Courier New" w:hAnsi="Courier New"/>
+        </w:rPr>
+        <w:t>dashboard_data.json</w:t>
+      </w:r>
+      <w:r>
+        <w:t xml:space="preserve"> (~1.2 MB) untuk dikonsumsi langsung oleh client-side dashboard secara asinkron.</w:t>
+      </w:r>
+    </w:p>
+    <w:p>
+      <w:pPr>
+        <w:pStyle w:val="ListParagraph"/>
+      </w:pPr>
+      <w:r>
+        <w:t xml:space="preserve">• </w:t>
+      </w:r>
+      <w:r>
+        <w:rPr>
+          <w:b/>
+        </w:rPr>
+        <w:t>Azure Functions (Serverless Orchestrator V2):</w:t>
+      </w:r>
+    </w:p>
+    <w:p>
+      <w:pPr>
+        <w:pStyle w:val="ListParagraph"/>
+      </w:pPr>
+      <w:r>
+        <w:t xml:space="preserve">• </w:t>
+      </w:r>
+      <w:r>
+        <w:rPr>
+          <w:i/>
+        </w:rPr>
+        <w:t>Runtime &amp; Environment</w:t>
+      </w:r>
+      <w:r>
+        <w:t>: Menggunakan Python 3.11. Mengadopsi Azure Functions V2 Programming Model untuk penyusunan kode dekorator yang modular.</w:t>
+      </w:r>
+    </w:p>
+    <w:p>
+      <w:pPr>
+        <w:pStyle w:val="ListParagraph"/>
+      </w:pPr>
+      <w:r>
+        <w:t xml:space="preserve">• </w:t>
+      </w:r>
+      <w:r>
+        <w:rPr>
+          <w:i/>
+        </w:rPr>
+        <w:t>Triggering</w:t>
+      </w:r>
+      <w:r>
+        <w:t xml:space="preserve">: Berjalan otomatis dua kali sehari (pukul 08:00 WIB dan 14:00 WIB) menggunakan Timer Trigger dengan ekspresi cron UTC </w:t>
+      </w:r>
+      <w:r>
+        <w:rPr>
+          <w:rFonts w:ascii="Courier New" w:hAnsi="Courier New"/>
+        </w:rPr>
+        <w:t>"0 0 1,7 * * *"</w:t>
+      </w:r>
+      <w:r>
+        <w:t>.</w:t>
+      </w:r>
+    </w:p>
+    <w:p>
+      <w:pPr>
+        <w:pStyle w:val="ListParagraph"/>
+      </w:pPr>
+      <w:r>
+        <w:t xml:space="preserve">• </w:t>
+      </w:r>
+      <w:r>
+        <w:rPr>
+          <w:i/>
+        </w:rPr>
+        <w:t>Timeout Optimization</w:t>
+      </w:r>
+      <w:r>
+        <w:t xml:space="preserve">: Batas durasi eksekusi ditingkatkan menjadi </w:t>
+      </w:r>
+      <w:r>
+        <w:rPr>
+          <w:b/>
+        </w:rPr>
+        <w:t>10 menit</w:t>
+      </w:r>
+      <w:r>
+        <w:t xml:space="preserve"> (</w:t>
+      </w:r>
+      <w:r>
+        <w:rPr>
+          <w:rFonts w:ascii="Courier New" w:hAnsi="Courier New"/>
+        </w:rPr>
+        <w:t>"functionTimeout": "00:10:00"</w:t>
+      </w:r>
+      <w:r>
+        <w:t xml:space="preserve"> pada host.json) untuk memberikan ruang komputasi yang aman saat melatih 84 model Prophet secara in-memory (RAM).</w:t>
+      </w:r>
+    </w:p>
+    <w:p>
+      <w:pPr>
+        <w:pStyle w:val="ListParagraph"/>
+      </w:pPr>
+      <w:r>
+        <w:t xml:space="preserve">• </w:t>
+      </w:r>
+      <w:r>
+        <w:rPr>
+          <w:b/>
+        </w:rPr>
+        <w:t>Azure Machine Learning Studio (MLflow API Tracking):</w:t>
+      </w:r>
+    </w:p>
+    <w:p>
+      <w:pPr>
+        <w:pStyle w:val="ListParagraph"/>
+      </w:pPr>
+      <w:r>
+        <w:t xml:space="preserve">• </w:t>
+      </w:r>
+      <w:r>
+        <w:rPr>
+          <w:i/>
+        </w:rPr>
+        <w:t>MLOps Engine</w:t>
+      </w:r>
+      <w:r>
+        <w:t>: Mengintegrasikan MLflow API secara native untuk melacak performa model. Setiap pemicuan harian mencatat metrik MAE, RMSE, dan MAPE secara real-time.</w:t>
+      </w:r>
+    </w:p>
+    <w:p>
+      <w:pPr>
+        <w:pStyle w:val="ListParagraph"/>
+      </w:pPr>
+      <w:r>
+        <w:t xml:space="preserve">• </w:t>
+      </w:r>
+      <w:r>
+        <w:rPr>
+          <w:i/>
+        </w:rPr>
+        <w:t>Struktur Nested Runs</w:t>
+      </w:r>
+      <w:r>
+        <w:t>: Menerapkan 1 Parent Run harian (menandakan batch eksekusi) dengan 84 Child Runs (merepresentasikan model per komoditas dan daerah).</w:t>
+      </w:r>
+    </w:p>
+    <w:p>
+      <w:pPr>
+        <w:pStyle w:val="ListParagraph"/>
+      </w:pPr>
+      <w:r>
+        <w:t xml:space="preserve">• </w:t>
+      </w:r>
+      <w:r>
+        <w:rPr>
+          <w:i/>
+        </w:rPr>
+        <w:t>Compute-Storage Optimization</w:t>
+      </w:r>
+      <w:r>
+        <w:t xml:space="preserve">: Berkas </w:t>
+      </w:r>
+      <w:r>
+        <w:rPr>
+          <w:rFonts w:ascii="Courier New" w:hAnsi="Courier New"/>
+        </w:rPr>
+        <w:t>model.json</w:t>
+      </w:r>
+      <w:r>
+        <w:t xml:space="preserve"> hanya diunggah untuk 21 model agregasi utama provinsi untuk menghemat penyimpanan cloud.</w:t>
+      </w:r>
+    </w:p>
+    <w:p>
+      <w:pPr>
+        <w:pStyle w:val="ListParagraph"/>
+      </w:pPr>
+      <w:r>
+        <w:t xml:space="preserve">• </w:t>
+      </w:r>
+      <w:r>
+        <w:rPr>
+          <w:b/>
+        </w:rPr>
+        <w:t>Azure Static Web Apps (SWA):</w:t>
+      </w:r>
+    </w:p>
+    <w:p>
+      <w:pPr>
+        <w:pStyle w:val="ListParagraph"/>
+      </w:pPr>
+      <w:r>
+        <w:t xml:space="preserve">• </w:t>
+      </w:r>
+      <w:r>
+        <w:rPr>
+          <w:i/>
+        </w:rPr>
+        <w:t>Hosting Frontend</w:t>
+      </w:r>
+      <w:r>
+        <w:t xml:space="preserve">: Menyajikan dasbor bertema </w:t>
+      </w:r>
+      <w:r>
+        <w:rPr>
+          <w:i/>
+        </w:rPr>
+        <w:t>Dark Glassmorphism</w:t>
+      </w:r>
+      <w:r>
+        <w:t xml:space="preserve"> (HTML/CSS/JS) dengan integrasi build otomatis GitHub Actions. Menyediakan sertifikat SSL gratis secara otomatis dan disebarkan melalui Microsoft Global CDN dengan latency pemuatan dasbor &lt; 1.5 detik.</w:t>
+      </w:r>
+    </w:p>
+    <w:p>
+      <w:pPr>
+        <w:pStyle w:val="Heading4"/>
+      </w:pPr>
+      <w:r>
+        <w:t>2. Keamanan &amp; Autentikasi: Entra ID Managed Identity (MSI) &amp; RBAC</w:t>
+      </w:r>
+    </w:p>
+    <w:p>
       <w:pPr/>
       <w:r>
-        <w:t xml:space="preserve">• </w:t>
-      </w:r>
-      <w:r>
-        <w:rPr>
-          <w:b/>
-        </w:rPr>
-        <w:t>Azure Blob Storage (Data Lake &amp; Static Content Hosting):</w:t>
+        <w:t xml:space="preserve">Untuk menghindari kebocoran kredensial (seperti password atau API Key Azure ML) pada repositori kode publik, ARM menggunakan </w:t>
+      </w:r>
+      <w:r>
+        <w:rPr>
+          <w:b/>
+        </w:rPr>
+        <w:t>System-Assigned Managed Identity</w:t>
+      </w:r>
+      <w:r>
+        <w:t xml:space="preserve"> (Entra ID / Active Directory):</w:t>
+      </w:r>
+    </w:p>
+    <w:p>
+      <w:pPr>
+        <w:pStyle w:val="ListParagraph"/>
+      </w:pPr>
+      <w:r>
+        <w:t xml:space="preserve">• </w:t>
+      </w:r>
+      <w:r>
+        <w:rPr>
+          <w:b/>
+        </w:rPr>
+        <w:t>Koneksi Tanpa Kunci (Passwordless)</w:t>
+      </w:r>
+      <w:r>
+        <w:t>: Azure Function App dikonfigurasi agar memiliki identitas unik yang terdaftar pada sistem Azure Active Directory.</w:t>
+      </w:r>
+    </w:p>
+    <w:p>
+      <w:pPr>
+        <w:pStyle w:val="ListParagraph"/>
+      </w:pPr>
+      <w:r>
+        <w:t xml:space="preserve">• </w:t>
+      </w:r>
+      <w:r>
+        <w:rPr>
+          <w:b/>
+        </w:rPr>
+        <w:t>Role-Based Access Control (RBAC)</w:t>
+      </w:r>
+      <w:r>
+        <w:t xml:space="preserve">: Juri dan administrator dapat menjalankan script </w:t>
+      </w:r>
+      <w:r>
+        <w:rPr>
+          <w:rFonts w:ascii="Courier New" w:hAnsi="Courier New"/>
+        </w:rPr>
+        <w:t>make fix-msi</w:t>
+      </w:r>
+      <w:r>
+        <w:t xml:space="preserve"> yang secara otomatis memberikan peran </w:t>
+      </w:r>
+      <w:r>
+        <w:rPr>
+          <w:b/>
+        </w:rPr>
+        <w:t>Contributor</w:t>
+      </w:r>
+      <w:r>
+        <w:t xml:space="preserve"> kepada identitas Azure Functions pada scope Resource Group proyek:</w:t>
       </w:r>
     </w:p>
     <w:p>
       <w:pPr/>
       <w:r>
-        <w:t xml:space="preserve">• </w:t>
+        <w:rPr>
+          <w:rFonts w:ascii="Courier New" w:hAnsi="Courier New"/>
+        </w:rPr>
+      </w:r>
+      <w:r>
+        <w:rPr>
+          <w:rFonts w:ascii="Courier New" w:hAnsi="Courier New"/>
+        </w:rPr>
+        <w:t xml:space="preserve">bash az role assignment create --assignee "&lt;principal-id&gt;" --role "Contributor" --scope "/subscriptions/&lt;sub-id&gt;/resourceGroups/&lt;rg-name&gt;" </w:t>
+      </w:r>
+      <w:r>
+        <w:rPr>
+          <w:rFonts w:ascii="Courier New" w:hAnsi="Courier New"/>
+        </w:rPr>
+      </w:r>
+    </w:p>
+    <w:p>
+      <w:pPr>
+        <w:pStyle w:val="ListParagraph"/>
+      </w:pPr>
+      <w:r>
+        <w:t xml:space="preserve">• </w:t>
+      </w:r>
+      <w:r>
+        <w:rPr>
+          <w:b/>
+        </w:rPr>
+        <w:t>Keamanan MLflow</w:t>
+      </w:r>
+      <w:r>
+        <w:t xml:space="preserve">: Pustaka MLflow pada Azure Functions mengenali token Managed Identity secara otomatis di cloud untuk melakukan </w:t>
       </w:r>
       <w:r>
         <w:rPr>
           <w:i/>
         </w:rPr>
-        <w:t>Data Lake Privat (`arm-raw-data`)</w:t>
-      </w:r>
-      <w:r>
-        <w:t>: Menyimpan data historis tahunan harga pangan (</w:t>
+        <w:t>handshake</w:t>
+      </w:r>
+      <w:r>
+        <w:t xml:space="preserve"> autentikasi dengan Workspace Azure ML Studio tanpa menuliskan berkas </w:t>
       </w:r>
       <w:r>
         <w:rPr>
           <w:rFonts w:ascii="Courier New" w:hAnsi="Courier New"/>
         </w:rPr>
-        <w:t>2021.json</w:t>
-      </w:r>
-      <w:r>
-        <w:t xml:space="preserve"> s/d </w:t>
+        <w:t>config.json</w:t>
+      </w:r>
+      <w:r>
+        <w:t xml:space="preserve"> rahasia di dalam paket deployment.</w:t>
+      </w:r>
+    </w:p>
+    <w:p>
+      <w:pPr>
+        <w:pStyle w:val="Heading4"/>
+      </w:pPr>
+      <w:r>
+        <w:t>3. Integrasi Jaringan &amp; Kebijakan CORS</w:t>
+      </w:r>
+    </w:p>
+    <w:p>
+      <w:pPr>
+        <w:pStyle w:val="ListParagraph"/>
+      </w:pPr>
+      <w:r>
+        <w:t xml:space="preserve">• </w:t>
+      </w:r>
+      <w:r>
+        <w:rPr>
+          <w:b/>
+        </w:rPr>
+        <w:t>Masalah Cross-Origin</w:t>
+      </w:r>
+      <w:r>
+        <w:t xml:space="preserve">: Dasbor web yang dihosting di Azure Static Web Apps perlu mengambil berkas data </w:t>
       </w:r>
       <w:r>
         <w:rPr>
           <w:rFonts w:ascii="Courier New" w:hAnsi="Courier New"/>
         </w:rPr>
-        <w:t>2026.json</w:t>
-      </w:r>
-      <w:r>
-        <w:t>) dalam level granular 2 (sub-komoditas). Folder diatur secara privat untuk mencegah kebocoran data hulu.</w:t>
+        <w:t>dashboard_data.json</w:t>
+      </w:r>
+      <w:r>
+        <w:t xml:space="preserve"> dari Azure Blob Storage. Tanpa konfigurasi CORS, kebijakan keamanan browser akan memblokir request tersebut.</w:t>
+      </w:r>
+    </w:p>
+    <w:p>
+      <w:pPr>
+        <w:pStyle w:val="ListParagraph"/>
+      </w:pPr>
+      <w:r>
+        <w:t xml:space="preserve">• </w:t>
+      </w:r>
+      <w:r>
+        <w:rPr>
+          <w:b/>
+        </w:rPr>
+        <w:t>Solusi Konfigurasi CORS</w:t>
+      </w:r>
+      <w:r>
+        <w:t xml:space="preserve">: Melalui Azure CLI, aturan CORS pada Storage Account dikonfigurasi secara ketat untuk hanya menerima metode </w:t>
+      </w:r>
+      <w:r>
+        <w:rPr>
+          <w:rFonts w:ascii="Courier New" w:hAnsi="Courier New"/>
+        </w:rPr>
+        <w:t>GET</w:t>
+      </w:r>
+      <w:r>
+        <w:t xml:space="preserve"> dari domain resmi dasbor Static Web Apps dan domain pengujian lokal:</w:t>
       </w:r>
     </w:p>
     <w:p>
       <w:pPr/>
       <w:r>
-        <w:t xml:space="preserve">• </w:t>
+        <w:rPr>
+          <w:rFonts w:ascii="Courier New" w:hAnsi="Courier New"/>
+        </w:rPr>
+      </w:r>
+      <w:r>
+        <w:rPr>
+          <w:rFonts w:ascii="Courier New" w:hAnsi="Courier New"/>
+        </w:rPr>
+        <w:t xml:space="preserve">bash az storage cors add --methods GET --origins "https://thankful-river-084494910.7.azurestaticapps.net" "http://localhost:8000" --services b --connection-string "$(CONNECTION_STRING)" </w:t>
+      </w:r>
+      <w:r>
+        <w:rPr>
+          <w:rFonts w:ascii="Courier New" w:hAnsi="Courier New"/>
+        </w:rPr>
+      </w:r>
+    </w:p>
+    <w:p>
+      <w:pPr>
+        <w:pStyle w:val="ListParagraph"/>
+      </w:pPr>
+      <w:r>
+        <w:t xml:space="preserve">• </w:t>
+      </w:r>
+      <w:r>
+        <w:rPr>
+          <w:b/>
+        </w:rPr>
+        <w:t>Konfigurasi Dasbor SWA</w:t>
+      </w:r>
+      <w:r>
+        <w:t xml:space="preserve">: Menggunakan staticwebapp.config.json untuk mengatur header keamanan browser seperti </w:t>
+      </w:r>
+      <w:r>
+        <w:rPr>
+          <w:rFonts w:ascii="Courier New" w:hAnsi="Courier New"/>
+        </w:rPr>
+        <w:t>Content-Security-Policy</w:t>
+      </w:r>
+      <w:r>
+        <w:t xml:space="preserve"> dan </w:t>
+      </w:r>
+      <w:r>
+        <w:rPr>
+          <w:rFonts w:ascii="Courier New" w:hAnsi="Courier New"/>
+        </w:rPr>
+        <w:t>X-Frame-Options</w:t>
+      </w:r>
+      <w:r>
+        <w:t xml:space="preserve"> guna memperkokoh keamanan frontend.</w:t>
+      </w:r>
+    </w:p>
+    <w:p>
+      <w:pPr>
+        <w:pStyle w:val="Heading4"/>
+      </w:pPr>
+      <w:r>
+        <w:t>4. Integrasi CI/CD &amp; GitHub Actions</w:t>
+      </w:r>
+    </w:p>
+    <w:p>
+      <w:pPr/>
+      <w:r>
+        <w:t xml:space="preserve">ARM mengintegrasikan repositori GitHub secara native dengan Azure Static Web Apps untuk menerapkan jalur otomatisasi </w:t>
+      </w:r>
+      <w:r>
+        <w:rPr>
+          <w:b/>
+        </w:rPr>
+        <w:t>Continuous Integration &amp; Continuous Deployment (CI/CD)</w:t>
+      </w:r>
+      <w:r>
+        <w:t>:</w:t>
+      </w:r>
+    </w:p>
+    <w:p>
+      <w:pPr>
+        <w:pStyle w:val="ListParagraph"/>
+      </w:pPr>
+      <w:r>
+        <w:t xml:space="preserve">• </w:t>
+      </w:r>
+      <w:r>
+        <w:rPr>
+          <w:b/>
+        </w:rPr>
+        <w:t>Pemicu Otomatis (Triggers)</w:t>
+      </w:r>
+      <w:r>
+        <w:t xml:space="preserve">: Setiap kali anggota tim melakukan </w:t>
+      </w:r>
+      <w:r>
+        <w:rPr>
+          <w:rFonts w:ascii="Courier New" w:hAnsi="Courier New"/>
+        </w:rPr>
+        <w:t>push</w:t>
+      </w:r>
+      <w:r>
+        <w:t xml:space="preserve"> atau menggabungkan </w:t>
       </w:r>
       <w:r>
         <w:rPr>
           <w:i/>
         </w:rPr>
-        <w:t>Web Feed Container (`$web`)</w:t>
-      </w:r>
-      <w:r>
-        <w:t xml:space="preserve">: Menyimpan file hasil agregasi terkompresi </w:t>
+        <w:t>Pull Request</w:t>
+      </w:r>
+      <w:r>
+        <w:t xml:space="preserve"> ke cabang utama </w:t>
       </w:r>
       <w:r>
         <w:rPr>
           <w:rFonts w:ascii="Courier New" w:hAnsi="Courier New"/>
         </w:rPr>
-        <w:t>dashboard_data.json</w:t>
-      </w:r>
-      <w:r>
-        <w:t xml:space="preserve"> (~1.2 MB) untuk dikonsumsi langsung oleh client-side dashboard secara asinkron.</w:t>
+        <w:t>master</w:t>
+      </w:r>
+      <w:r>
+        <w:t xml:space="preserve">, GitHub Actions akan memicu berkas workflow </w:t>
+      </w:r>
+      <w:r>
+        <w:rPr>
+          <w:rFonts w:ascii="Courier New" w:hAnsi="Courier New"/>
+        </w:rPr>
+        <w:t>.github/workflows/azure-static-web-apps-thankful-river-084494910.yml</w:t>
+      </w:r>
+      <w:r>
+        <w:t>.</w:t>
+      </w:r>
+    </w:p>
+    <w:p>
+      <w:pPr>
+        <w:pStyle w:val="ListParagraph"/>
+      </w:pPr>
+      <w:r>
+        <w:t xml:space="preserve">• </w:t>
+      </w:r>
+      <w:r>
+        <w:rPr>
+          <w:b/>
+        </w:rPr>
+        <w:t>Proses Build &amp; Deploy</w:t>
+      </w:r>
+      <w:r>
+        <w:t>: Pekerjaan (Job) GitHub runner berbasis Ubuntu akan memeriksa kode sumber (</w:t>
+      </w:r>
+      <w:r>
+        <w:rPr>
+          <w:i/>
+        </w:rPr>
+        <w:t>checkout</w:t>
+      </w:r>
+      <w:r>
+        <w:t xml:space="preserve">), memvalidasi struktur, mengompilasi aset dasbor frontend, dan mendorongnya ke server CDN Azure menggunakan token rahasia </w:t>
+      </w:r>
+      <w:r>
+        <w:rPr>
+          <w:rFonts w:ascii="Courier New" w:hAnsi="Courier New"/>
+        </w:rPr>
+        <w:t>AZURE_STATIC_WEB_APPS_API_TOKEN_THANKFUL_RIVER_084494910</w:t>
+      </w:r>
+      <w:r>
+        <w:t xml:space="preserve"> yang tersimpan aman di GitHub Repository Secrets.</w:t>
+      </w:r>
+    </w:p>
+    <w:p>
+      <w:pPr>
+        <w:pStyle w:val="ListParagraph"/>
+      </w:pPr>
+      <w:r>
+        <w:t xml:space="preserve">• </w:t>
+      </w:r>
+      <w:r>
+        <w:rPr>
+          <w:b/>
+        </w:rPr>
+        <w:t>Zero-Downtime Deployment</w:t>
+      </w:r>
+      <w:r>
+        <w:t>: Azure Static Web Apps memastikan transisi antar-versi dasbor berjalan tanpa interupsi bagi pengguna akhir (TPID/Satgas Pangan).</w:t>
+      </w:r>
+    </w:p>
+    <w:p>
+      <w:pPr>
+        <w:pStyle w:val="Heading4"/>
+      </w:pPr>
+      <w:r>
+        <w:t>5. Otomasi CLI &amp; Operasional Cloud (Makefile)</w:t>
       </w:r>
     </w:p>
     <w:p>
       <w:pPr/>
       <w:r>
-        <w:t xml:space="preserve">• </w:t>
-      </w:r>
-      <w:r>
-        <w:rPr>
-          <w:b/>
-        </w:rPr>
-        <w:t>Azure Functions (Serverless Orchestrator V2):</w:t>
+        <w:t>Seluruh operasi manajemen sumber daya Azure dibungkus ke dalam shortcut perintah otomatis pada Makefile untuk memastikan efisiensi pengelolaan bagi tim pengembang:</w:t>
+      </w:r>
+    </w:p>
+    <w:p>
+      <w:pPr>
+        <w:pStyle w:val="ListParagraph"/>
+      </w:pPr>
+      <w:r>
+        <w:t xml:space="preserve">• </w:t>
+      </w:r>
+      <w:r>
+        <w:rPr>
+          <w:rFonts w:ascii="Courier New" w:hAnsi="Courier New"/>
+        </w:rPr>
+        <w:t>make deploy-functions</w:t>
+      </w:r>
+      <w:r>
+        <w:t xml:space="preserve"> : Mengompilasi dependensi local </w:t>
+      </w:r>
+      <w:r>
+        <w:rPr>
+          <w:rFonts w:ascii="Courier New" w:hAnsi="Courier New"/>
+        </w:rPr>
+        <w:t>requirements.txt</w:t>
+      </w:r>
+      <w:r>
+        <w:t xml:space="preserve"> dan mengunggah kode serverless ke Azure Function App.</w:t>
+      </w:r>
+    </w:p>
+    <w:p>
+      <w:pPr>
+        <w:pStyle w:val="ListParagraph"/>
+      </w:pPr>
+      <w:r>
+        <w:t xml:space="preserve">• </w:t>
+      </w:r>
+      <w:r>
+        <w:rPr>
+          <w:rFonts w:ascii="Courier New" w:hAnsi="Courier New"/>
+        </w:rPr>
+        <w:t>make upload-dashboard</w:t>
+      </w:r>
+      <w:r>
+        <w:t xml:space="preserve"> : Melakukan unggahan batch berkas frontend dasbor (</w:t>
+      </w:r>
+      <w:r>
+        <w:rPr>
+          <w:rFonts w:ascii="Courier New" w:hAnsi="Courier New"/>
+        </w:rPr>
+        <w:t>dashboard/</w:t>
+      </w:r>
+      <w:r>
+        <w:t xml:space="preserve">) langsung ke penampung </w:t>
+      </w:r>
+      <w:r>
+        <w:rPr>
+          <w:rFonts w:ascii="Courier New" w:hAnsi="Courier New"/>
+        </w:rPr>
+        <w:t>$web</w:t>
+      </w:r>
+      <w:r>
+        <w:t xml:space="preserve"> Blob Storage.</w:t>
+      </w:r>
+    </w:p>
+    <w:p>
+      <w:pPr>
+        <w:pStyle w:val="ListParagraph"/>
+      </w:pPr>
+      <w:r>
+        <w:t xml:space="preserve">• </w:t>
+      </w:r>
+      <w:r>
+        <w:rPr>
+          <w:rFonts w:ascii="Courier New" w:hAnsi="Courier New"/>
+        </w:rPr>
+        <w:t>make trigger-cloud</w:t>
+      </w:r>
+      <w:r>
+        <w:t xml:space="preserve">    : Menarik Master Key admin dari Azure Portal secara asinkron lalu mengirimkan request POST HTTP untuk memaksa pemicuan pipeline di cloud.</w:t>
+      </w:r>
+    </w:p>
+    <w:p>
+      <w:pPr>
+        <w:pStyle w:val="ListParagraph"/>
+      </w:pPr>
+      <w:r>
+        <w:t xml:space="preserve">• </w:t>
+      </w:r>
+      <w:r>
+        <w:rPr>
+          <w:rFonts w:ascii="Courier New" w:hAnsi="Courier New"/>
+        </w:rPr>
+        <w:t>make monitor-logs</w:t>
+      </w:r>
+      <w:r>
+        <w:t xml:space="preserve">     : Menjalankan kueri Kusto (KQL) ke Application Insights untuk menampilkan 30 jejak log eksekusi pipeline cloud terbaru langsung pada terminal lokal.</w:t>
+      </w:r>
+    </w:p>
+    <w:p>
+      <w:pPr>
+        <w:pStyle w:val="ListParagraph"/>
+      </w:pPr>
+      <w:r>
+        <w:t xml:space="preserve">• </w:t>
+      </w:r>
+      <w:r>
+        <w:rPr>
+          <w:rFonts w:ascii="Courier New" w:hAnsi="Courier New"/>
+        </w:rPr>
+        <w:t>make fix-cors</w:t>
+      </w:r>
+      <w:r>
+        <w:t xml:space="preserve">         : Mengatur ulang kebijakan akses CORS pada Storage Account dan Function App.</w:t>
+      </w:r>
+    </w:p>
+    <w:p>
+      <w:pPr>
+        <w:pStyle w:val="ListParagraph"/>
+      </w:pPr>
+      <w:r>
+        <w:t xml:space="preserve">• </w:t>
+      </w:r>
+      <w:r>
+        <w:rPr>
+          <w:rFonts w:ascii="Courier New" w:hAnsi="Courier New"/>
+        </w:rPr>
+        <w:t>make fix-msi</w:t>
+      </w:r>
+      <w:r>
+        <w:t xml:space="preserve">          : Mengotomatiskan pemberian hak Managed Identity pada tingkat Resource Group.</w:t>
+      </w:r>
+    </w:p>
+    <w:p>
+      <w:pPr>
+        <w:pStyle w:val="Heading4"/>
+      </w:pPr>
+      <w:r>
+        <w:t>6. Protokol Sinkronisasi Data (Opsi A - Hybrid Streaming)</w:t>
       </w:r>
     </w:p>
     <w:p>
       <w:pPr/>
       <w:r>
-        <w:t xml:space="preserve">• </w:t>
-      </w:r>
+        <w:t xml:space="preserve">Untuk menjaga sinkronisasi data yang konsisten antara lokal, scraper, dan cloud data lake, ARM menggunakan model sinkronisasi hibrida: </w:t>
+      </w:r>
+      <w:r>
+        <w:rPr>
+          <w:rFonts w:ascii="Courier New" w:hAnsi="Courier New"/>
+        </w:rPr>
+      </w:r>
+      <w:r>
+        <w:rPr>
+          <w:rFonts w:ascii="Courier New" w:hAnsi="Courier New"/>
+        </w:rPr>
+        <w:t xml:space="preserve"> [Azure Functions Timer Trigger] │ ├── 1. Panggil scraper.py harian ➔ Tarik data terbaru dari web PIHPS Bank Indonesia │ ├── 2. Ambil berkas JSON tahun berjalan (2026.json) dari privat Blob Storage │ ├── 3. Lakukan append baris harga baru ➔ Unggah kembali berkas 2026.json ke Data Lake Privat │ ├── 4. Muat seluruh berkas historis (2021.json s/d 2026.json) ke memori RAM Functions │ ├── 5. Lakukan deteksi anomali statistik Z-Score harian │ ├── 6. Jalankan pemodelan latih ulang Prophet (84 model) secara paralel di RAM │ ├── 7. Kompresi seluruh data analisis dan simpan sebagai dashboard_data.json (~1.2 MB) │ ├── 8. Unggah dashboard_data.json ke container publik $web Blob Storage │ └── 9. Kirim ringkasan peringatan taktis ke Telegram &amp; metrik evaluasi ke Azure ML Studio </w:t>
+      </w:r>
+      <w:r>
+        <w:rPr>
+          <w:rFonts w:ascii="Courier New" w:hAnsi="Courier New"/>
+        </w:rPr>
+      </w:r>
+    </w:p>
+    <w:p>
+      <w:pPr>
+        <w:pStyle w:val="Heading4"/>
+      </w:pPr>
+      <w:r>
+        <w:t>7. Bukti Dokumentasi Visual Azure (Screenshots)</w:t>
+      </w:r>
+    </w:p>
+    <w:p>
+      <w:pPr/>
+      <w:r>
+        <w:t>Untuk memberikan validasi nyata kepada juri bahwa infrastruktur cloud ARM telah berjalan 100% aktif dan terintegrasi di server Microsoft Azure, berikut adalah bukti tangkapan layar sistem yang harus disematkan:</w:t>
+      </w:r>
+    </w:p>
+    <w:p>
+      <w:pPr>
+        <w:pStyle w:val="Heading5"/>
+      </w:pPr>
+      <w:r>
+        <w:t>A. Pelacakan Eksperimen Azure ML Studio (MLflow)</w:t>
+      </w:r>
+    </w:p>
+    <w:p>
+      <w:pPr/>
+      <w:r>
+        <w:t>Menampilkan daftar Parent Run harian dengan nested Child Runs untuk 84 model Prophet, lengkap dengan pencatatan parameter komoditas dan metrik evaluasi (MAPE/MAE/RMSE):</w:t>
+      </w:r>
+    </w:p>
+    <w:p>
+      <w:pPr/>
       <w:r>
         <w:rPr>
           <w:i/>
         </w:rPr>
-        <w:t>Runtime &amp; Environment</w:t>
-      </w:r>
-      <w:r>
-        <w:t>: Menggunakan Python 3.11. Mengadopsi Azure Functions V2 Programming Model untuk penyusunan kode dekorator yang modular.</w:t>
+        <w:t>[Gambar: Azure ML Studio - MLflow Run History - Path: docs/images/azure_mlflow_runs.png]</w:t>
       </w:r>
     </w:p>
     <w:p>
       <w:pPr/>
       <w:r>
-        <w:t xml:space="preserve">• </w:t>
-      </w:r>
-      <w:r>
         <w:rPr>
           <w:i/>
         </w:rPr>
-        <w:t>Triggering</w:t>
-      </w:r>
-      <w:r>
-        <w:t xml:space="preserve">: Berjalan otomatis dua kali sehari (pukul 08:00 WIB dan 14:00 WIB) menggunakan Timer Trigger dengan ekspresi cron UTC </w:t>
+        <w:t>Tangkapan layar workspace Azure ML Studio yang menunjukkan visualisasi performa run model.</w:t>
+      </w:r>
+    </w:p>
+    <w:p>
+      <w:pPr>
+        <w:pStyle w:val="Heading5"/>
+      </w:pPr>
+      <w:r>
+        <w:t>B. Eksekusi Serverless Azure Functions</w:t>
+      </w:r>
+    </w:p>
+    <w:p>
+      <w:pPr/>
+      <w:r>
+        <w:t xml:space="preserve">Menampilkan log eksekusi berkala dari timer trigger </w:t>
       </w:r>
       <w:r>
         <w:rPr>
           <w:rFonts w:ascii="Courier New" w:hAnsi="Courier New"/>
         </w:rPr>
-        <w:t>"0 0 1,7 * * *"</w:t>
-      </w:r>
-      <w:r>
-        <w:t>.</w:t>
+        <w:t>arm_daily_pipeline</w:t>
+      </w:r>
+      <w:r>
+        <w:t xml:space="preserve"> yang berhasil melakukan scraping data PIHPS, kalkulasi modeling di RAM, dan pengiriman alert Telegram:</w:t>
       </w:r>
     </w:p>
     <w:p>
       <w:pPr/>
       <w:r>
-        <w:t xml:space="preserve">• </w:t>
-      </w:r>
-      <w:r>
         <w:rPr>
           <w:i/>
         </w:rPr>
-        <w:t>Timeout Optimization</w:t>
-      </w:r>
-      <w:r>
-        <w:t xml:space="preserve">: Batas durasi eksekusi ditingkatkan menjadi </w:t>
-      </w:r>
-      <w:r>
-        <w:rPr>
-          <w:b/>
-        </w:rPr>
-        <w:t>10 menit</w:t>
-      </w:r>
-      <w:r>
-        <w:t xml:space="preserve"> (</w:t>
+        <w:t>[Gambar: Azure Functions - Daily Pipeline Execution Logs - Path: docs/images/azure_functions_logs.png]</w:t>
+      </w:r>
+    </w:p>
+    <w:p>
+      <w:pPr/>
+      <w:r>
+        <w:rPr>
+          <w:i/>
+        </w:rPr>
+        <w:t>Tangkapan layar log eksekusi Azure Functions pada Application Insights.</w:t>
+      </w:r>
+    </w:p>
+    <w:p>
+      <w:pPr>
+        <w:pStyle w:val="Heading5"/>
+      </w:pPr>
+      <w:r>
+        <w:t>C. Penampung Data Lake Azure Blob Storage</w:t>
+      </w:r>
+    </w:p>
+    <w:p>
+      <w:pPr/>
+      <w:r>
+        <w:t>Menampilkan file JSON data mentah tahunan privat (</w:t>
       </w:r>
       <w:r>
         <w:rPr>
           <w:rFonts w:ascii="Courier New" w:hAnsi="Courier New"/>
         </w:rPr>
-        <w:t>"functionTimeout": "00:10:00"</w:t>
-      </w:r>
-      <w:r>
-        <w:t xml:space="preserve"> pada host.json) untuk memberikan ruang komputasi yang aman saat melatih 84 model Prophet secara in-memory (RAM).</w:t>
+        <w:t>arm-raw-data</w:t>
+      </w:r>
+      <w:r>
+        <w:t>) dan file serving dasbor publik (</w:t>
+      </w:r>
+      <w:r>
+        <w:rPr>
+          <w:rFonts w:ascii="Courier New" w:hAnsi="Courier New"/>
+        </w:rPr>
+        <w:t>$web/dashboard_data.json</w:t>
+      </w:r>
+      <w:r>
+        <w:t>):</w:t>
       </w:r>
     </w:p>
     <w:p>
       <w:pPr/>
       <w:r>
-        <w:t xml:space="preserve">• </w:t>
-      </w:r>
-      <w:r>
-        <w:rPr>
-          <w:b/>
-        </w:rPr>
-        <w:t>Azure Machine Learning Studio (MLflow API Tracking):</w:t>
+        <w:rPr>
+          <w:i/>
+        </w:rPr>
+        <w:t>[Gambar: Azure Storage Explorer - Blob Data Lake - Path: docs/images/azure_storage_containers.png]</w:t>
       </w:r>
     </w:p>
     <w:p>
       <w:pPr/>
       <w:r>
-        <w:t xml:space="preserve">• </w:t>
-      </w:r>
-      <w:r>
         <w:rPr>
           <w:i/>
         </w:rPr>
-        <w:t>MLOps Engine</w:t>
-      </w:r>
-      <w:r>
-        <w:t>: Mengintegrasikan MLflow API secara native untuk melacak performa model. Setiap pemicuan harian mencatat metrik MAE, RMSE, dan MAPE secara real-time.</w:t>
+        <w:t>Tangkapan layar struktur container Blob Storage pada Azure Portal.</w:t>
+      </w:r>
+    </w:p>
+    <w:p>
+      <w:pPr>
+        <w:pStyle w:val="Heading5"/>
+      </w:pPr>
+      <w:r>
+        <w:t>D. Jalur Integrasi CI/CD GitHub Actions</w:t>
       </w:r>
     </w:p>
     <w:p>
       <w:pPr/>
       <w:r>
-        <w:t xml:space="preserve">• </w:t>
-      </w:r>
+        <w:t>Menampilkan rekam jejak otomatisasi deploy frontend dasbor yang terhubung secara realtime dengan repositori GitHub:</w:t>
+      </w:r>
+    </w:p>
+    <w:p>
+      <w:pPr/>
       <w:r>
         <w:rPr>
           <w:i/>
         </w:rPr>
-        <w:t>Struktur Nested Runs</w:t>
-      </w:r>
-      <w:r>
-        <w:t>: Menerapkan 1 Parent Run harian (menandakan batch eksekusi) dengan 84 Child Runs (merepresentasikan model per komoditas dan daerah).</w:t>
+        <w:t>[Gambar: GitHub Actions - CI/CD Workflow for SWA - Path: docs/images/github_actions_workflow.png]</w:t>
       </w:r>
     </w:p>
     <w:p>
       <w:pPr/>
       <w:r>
-        <w:t xml:space="preserve">• </w:t>
-      </w:r>
-      <w:r>
         <w:rPr>
           <w:i/>
         </w:rPr>
-        <w:t>Compute-Storage Optimization</w:t>
-      </w:r>
-      <w:r>
-        <w:t xml:space="preserve">: Berkas </w:t>
-      </w:r>
-      <w:r>
-        <w:rPr>
-          <w:rFonts w:ascii="Courier New" w:hAnsi="Courier New"/>
-        </w:rPr>
-        <w:t>model.json</w:t>
-      </w:r>
-      <w:r>
-        <w:t xml:space="preserve"> hanya diunggah untuk 21 model agregasi utama provinsi untuk menghemat penyimpanan cloud.</w:t>
-      </w:r>
-    </w:p>
-    <w:p>
-      <w:pPr/>
-      <w:r>
-        <w:t xml:space="preserve">• </w:t>
-      </w:r>
-      <w:r>
-        <w:rPr>
-          <w:b/>
-        </w:rPr>
-        <w:t>Azure Static Web Apps (SWA):</w:t>
-      </w:r>
-    </w:p>
-    <w:p>
-      <w:pPr/>
-      <w:r>
-        <w:t xml:space="preserve">• </w:t>
-      </w:r>
-      <w:r>
-        <w:rPr>
-          <w:i/>
-        </w:rPr>
-        <w:t>Hosting Frontend</w:t>
-      </w:r>
-      <w:r>
-        <w:t xml:space="preserve">: Menyajikan dasbor bertema </w:t>
-      </w:r>
-      <w:r>
-        <w:rPr>
-          <w:i/>
-        </w:rPr>
-        <w:t>Dark Glassmorphism</w:t>
-      </w:r>
-      <w:r>
-        <w:t xml:space="preserve"> (HTML/CSS/JS) dengan integrasi build otomatis GitHub Actions. Menyediakan sertifikat SSL gratis secara otomatis dan disebarkan melalui Microsoft Global CDN dengan latency pemuatan dasbor &lt; 1.5 detik.</w:t>
-      </w:r>
-    </w:p>
-    <w:p>
-      <w:pPr>
-        <w:pStyle w:val="Heading3"/>
-      </w:pPr>
-      <w:r>
-        <w:t>2. Keamanan &amp; Autentikasi: Entra ID Managed Identity (MSI) &amp; RBAC</w:t>
-      </w:r>
-    </w:p>
-    <w:p>
-      <w:pPr/>
-      <w:r>
-        <w:t xml:space="preserve">Untuk menghindari kebocoran kredensial (seperti password atau API Key Azure ML) pada repositori kode publik, ARM menggunakan </w:t>
-      </w:r>
-      <w:r>
-        <w:rPr>
-          <w:b/>
-        </w:rPr>
-        <w:t>System-Assigned Managed Identity</w:t>
-      </w:r>
-      <w:r>
-        <w:t xml:space="preserve"> (Entra ID / Active Directory):</w:t>
-      </w:r>
-    </w:p>
-    <w:p>
-      <w:pPr/>
-      <w:r>
-        <w:t xml:space="preserve">• </w:t>
-      </w:r>
-      <w:r>
-        <w:rPr>
-          <w:b/>
-        </w:rPr>
-        <w:t>Koneksi Tanpa Kunci (Passwordless)</w:t>
-      </w:r>
-      <w:r>
-        <w:t>: Azure Function App dikonfigurasi agar memiliki identitas unik yang terdaftar pada sistem Azure Active Directory.</w:t>
-      </w:r>
-    </w:p>
-    <w:p>
-      <w:pPr/>
-      <w:r>
-        <w:t xml:space="preserve">• </w:t>
-      </w:r>
-      <w:r>
-        <w:rPr>
-          <w:b/>
-        </w:rPr>
-        <w:t>Role-Based Access Control (RBAC)</w:t>
-      </w:r>
-      <w:r>
-        <w:t xml:space="preserve">: Juri dan administrator dapat menjalankan script </w:t>
-      </w:r>
-      <w:r>
-        <w:rPr>
-          <w:rFonts w:ascii="Courier New" w:hAnsi="Courier New"/>
-        </w:rPr>
-        <w:t>make fix-msi</w:t>
-      </w:r>
-      <w:r>
-        <w:t xml:space="preserve"> yang secara otomatis memberikan peran </w:t>
-      </w:r>
-      <w:r>
-        <w:rPr>
-          <w:b/>
-        </w:rPr>
-        <w:t>Contributor</w:t>
-      </w:r>
-      <w:r>
-        <w:t xml:space="preserve"> kepada identitas Azure Functions pada scope Resource Group proyek:</w:t>
-      </w:r>
-    </w:p>
-    <w:p>
-      <w:pPr/>
-      <w:r>
-        <w:rPr>
-          <w:rFonts w:ascii="Courier New" w:hAnsi="Courier New"/>
-        </w:rPr>
-      </w:r>
-      <w:r>
-        <w:rPr>
-          <w:rFonts w:ascii="Courier New" w:hAnsi="Courier New"/>
-        </w:rPr>
-        <w:t xml:space="preserve">bash az role assignment create --assignee "&lt;principal-id&gt;" --role "Contributor" --scope "/subscriptions/&lt;sub-id&gt;/resourceGroups/&lt;rg-name&gt;" </w:t>
-      </w:r>
-      <w:r>
-        <w:rPr>
-          <w:rFonts w:ascii="Courier New" w:hAnsi="Courier New"/>
-        </w:rPr>
-      </w:r>
-    </w:p>
-    <w:p>
-      <w:pPr/>
-      <w:r>
-        <w:t xml:space="preserve">• </w:t>
-      </w:r>
-      <w:r>
-        <w:rPr>
-          <w:b/>
-        </w:rPr>
-        <w:t>Keamanan MLflow</w:t>
-      </w:r>
-      <w:r>
-        <w:t xml:space="preserve">: Pustaka MLflow pada Azure Functions mengenali token Managed Identity secara otomatis di cloud untuk melakukan </w:t>
-      </w:r>
-      <w:r>
-        <w:rPr>
-          <w:i/>
-        </w:rPr>
-        <w:t>handshake</w:t>
-      </w:r>
-      <w:r>
-        <w:t xml:space="preserve"> autentikasi dengan Workspace Azure ML Studio tanpa menuliskan berkas </w:t>
-      </w:r>
-      <w:r>
-        <w:rPr>
-          <w:rFonts w:ascii="Courier New" w:hAnsi="Courier New"/>
-        </w:rPr>
-        <w:t>config.json</w:t>
-      </w:r>
-      <w:r>
-        <w:t xml:space="preserve"> rahasia di dalam paket deployment.</w:t>
-      </w:r>
-    </w:p>
-    <w:p>
-      <w:pPr>
-        <w:pStyle w:val="Heading3"/>
-      </w:pPr>
-      <w:r>
-        <w:t>3. Integrasi Jaringan &amp; Kebijakan CORS</w:t>
-      </w:r>
-    </w:p>
-    <w:p>
-      <w:pPr/>
-      <w:r>
-        <w:t xml:space="preserve">• </w:t>
-      </w:r>
-      <w:r>
-        <w:rPr>
-          <w:b/>
-        </w:rPr>
-        <w:t>Masalah Cross-Origin</w:t>
-      </w:r>
-      <w:r>
-        <w:t xml:space="preserve">: Dasbor web yang dihosting di Azure Static Web Apps perlu mengambil berkas data </w:t>
-      </w:r>
-      <w:r>
-        <w:rPr>
-          <w:rFonts w:ascii="Courier New" w:hAnsi="Courier New"/>
-        </w:rPr>
-        <w:t>dashboard_data.json</w:t>
-      </w:r>
-      <w:r>
-        <w:t xml:space="preserve"> dari Azure Blob Storage. Tanpa konfigurasi CORS, kebijakan keamanan browser akan memblokir request tersebut.</w:t>
-      </w:r>
-    </w:p>
-    <w:p>
-      <w:pPr/>
-      <w:r>
-        <w:t xml:space="preserve">• </w:t>
-      </w:r>
-      <w:r>
-        <w:rPr>
-          <w:b/>
-        </w:rPr>
-        <w:t>Solusi Konfigurasi CORS</w:t>
-      </w:r>
-      <w:r>
-        <w:t xml:space="preserve">: Melalui Azure CLI, aturan CORS pada Storage Account dikonfigurasi secara ketat untuk hanya menerima metode </w:t>
-      </w:r>
-      <w:r>
-        <w:rPr>
-          <w:rFonts w:ascii="Courier New" w:hAnsi="Courier New"/>
-        </w:rPr>
-        <w:t>GET</w:t>
-      </w:r>
-      <w:r>
-        <w:t xml:space="preserve"> dari domain resmi dasbor Static Web Apps dan domain pengujian lokal:</w:t>
-      </w:r>
-    </w:p>
-    <w:p>
-      <w:pPr/>
-      <w:r>
-        <w:rPr>
-          <w:rFonts w:ascii="Courier New" w:hAnsi="Courier New"/>
-        </w:rPr>
-      </w:r>
-      <w:r>
-        <w:rPr>
-          <w:rFonts w:ascii="Courier New" w:hAnsi="Courier New"/>
-        </w:rPr>
-        <w:t xml:space="preserve">bash az storage cors add --methods GET --origins "https://thankful-river-084494910.7.azurestaticapps.net" "http://localhost:8000" --services b --connection-string "$(CONNECTION_STRING)" </w:t>
-      </w:r>
-      <w:r>
-        <w:rPr>
-          <w:rFonts w:ascii="Courier New" w:hAnsi="Courier New"/>
-        </w:rPr>
-      </w:r>
-    </w:p>
-    <w:p>
-      <w:pPr/>
-      <w:r>
-        <w:t xml:space="preserve">• </w:t>
-      </w:r>
-      <w:r>
-        <w:rPr>
-          <w:b/>
-        </w:rPr>
-        <w:t>Konfigurasi Dasbor SWA</w:t>
-      </w:r>
-      <w:r>
-        <w:t xml:space="preserve">: Menggunakan staticwebapp.config.json untuk mengatur header keamanan browser seperti </w:t>
-      </w:r>
-      <w:r>
-        <w:rPr>
-          <w:rFonts w:ascii="Courier New" w:hAnsi="Courier New"/>
-        </w:rPr>
-        <w:t>Content-Security-Policy</w:t>
-      </w:r>
-      <w:r>
-        <w:t xml:space="preserve"> dan </w:t>
-      </w:r>
-      <w:r>
-        <w:rPr>
-          <w:rFonts w:ascii="Courier New" w:hAnsi="Courier New"/>
-        </w:rPr>
-        <w:t>X-Frame-Options</w:t>
-      </w:r>
-      <w:r>
-        <w:t xml:space="preserve"> guna memperkokoh keamanan frontend.</w:t>
-      </w:r>
-    </w:p>
-    <w:p>
-      <w:pPr>
-        <w:pStyle w:val="Heading3"/>
-      </w:pPr>
-      <w:r>
-        <w:t>4. Integrasi CI/CD &amp; GitHub Actions</w:t>
-      </w:r>
-    </w:p>
-    <w:p>
-      <w:pPr/>
-      <w:r>
-        <w:t xml:space="preserve">ARM mengintegrasikan repositori GitHub secara native dengan Azure Static Web Apps untuk menerapkan jalur otomatisasi </w:t>
-      </w:r>
-      <w:r>
-        <w:rPr>
-          <w:b/>
-        </w:rPr>
-        <w:t>Continuous Integration &amp; Continuous Deployment (CI/CD)</w:t>
-      </w:r>
-      <w:r>
-        <w:t>:</w:t>
-      </w:r>
-    </w:p>
-    <w:p>
-      <w:pPr/>
-      <w:r>
-        <w:t xml:space="preserve">• </w:t>
-      </w:r>
-      <w:r>
-        <w:rPr>
-          <w:b/>
-        </w:rPr>
-        <w:t>Pemicu Otomatis (Triggers)</w:t>
-      </w:r>
-      <w:r>
-        <w:t xml:space="preserve">: Setiap kali anggota tim melakukan </w:t>
-      </w:r>
-      <w:r>
-        <w:rPr>
-          <w:rFonts w:ascii="Courier New" w:hAnsi="Courier New"/>
-        </w:rPr>
-        <w:t>push</w:t>
-      </w:r>
-      <w:r>
-        <w:t xml:space="preserve"> atau menggabungkan </w:t>
-      </w:r>
-      <w:r>
-        <w:rPr>
-          <w:i/>
-        </w:rPr>
-        <w:t>Pull Request</w:t>
-      </w:r>
-      <w:r>
-        <w:t xml:space="preserve"> ke cabang utama </w:t>
-      </w:r>
-      <w:r>
-        <w:rPr>
-          <w:rFonts w:ascii="Courier New" w:hAnsi="Courier New"/>
-        </w:rPr>
-        <w:t>master</w:t>
-      </w:r>
-      <w:r>
-        <w:t xml:space="preserve">, GitHub Actions akan memicu berkas workflow </w:t>
-      </w:r>
-      <w:r>
-        <w:rPr>
-          <w:rFonts w:ascii="Courier New" w:hAnsi="Courier New"/>
-        </w:rPr>
-        <w:t>.github/workflows/azure-static-web-apps-thankful-river-084494910.yml</w:t>
-      </w:r>
-      <w:r>
-        <w:t>.</w:t>
-      </w:r>
-    </w:p>
-    <w:p>
-      <w:pPr/>
-      <w:r>
-        <w:t xml:space="preserve">• </w:t>
-      </w:r>
-      <w:r>
-        <w:rPr>
-          <w:b/>
-        </w:rPr>
-        <w:t>Proses Build &amp; Deploy</w:t>
-      </w:r>
-      <w:r>
-        <w:t>: Pekerjaan (Job) GitHub runner berbasis Ubuntu akan memeriksa kode sumber (</w:t>
-      </w:r>
-      <w:r>
-        <w:rPr>
-          <w:i/>
-        </w:rPr>
-        <w:t>checkout</w:t>
-      </w:r>
-      <w:r>
-        <w:t xml:space="preserve">), memvalidasi struktur, mengompilasi aset dasbor frontend, dan mendorongnya ke server CDN Azure menggunakan token rahasia </w:t>
-      </w:r>
-      <w:r>
-        <w:rPr>
-          <w:rFonts w:ascii="Courier New" w:hAnsi="Courier New"/>
-        </w:rPr>
-        <w:t>AZURE_STATIC_WEB_APPS_API_TOKEN_THANKFUL_RIVER_084494910</w:t>
-      </w:r>
-      <w:r>
-        <w:t xml:space="preserve"> yang tersimpan aman di GitHub Repository Secrets.</w:t>
-      </w:r>
-    </w:p>
-    <w:p>
-      <w:pPr/>
-      <w:r>
-        <w:t xml:space="preserve">• </w:t>
-      </w:r>
-      <w:r>
-        <w:rPr>
-          <w:b/>
-        </w:rPr>
-        <w:t>Zero-Downtime Deployment</w:t>
-      </w:r>
-      <w:r>
-        <w:t>: Azure Static Web Apps memastikan transisi antar-versi dasbor berjalan tanpa interupsi bagi pengguna akhir (TPID/Satgas Pangan).</w:t>
-      </w:r>
-    </w:p>
-    <w:p>
-      <w:pPr>
-        <w:pStyle w:val="Heading3"/>
-      </w:pPr>
-      <w:r>
-        <w:t>5. Otomasi CLI &amp; Operasional Cloud (Makefile)</w:t>
-      </w:r>
-    </w:p>
-    <w:p>
-      <w:pPr/>
-      <w:r>
-        <w:t>Seluruh operasi manajemen sumber daya Azure dibungkus ke dalam shortcut perintah otomatis pada Makefile untuk memastikan efisiensi pengelolaan bagi tim pengembang:</w:t>
-      </w:r>
-    </w:p>
-    <w:p>
-      <w:pPr/>
-      <w:r>
-        <w:t xml:space="preserve">• </w:t>
-      </w:r>
-      <w:r>
-        <w:rPr>
-          <w:rFonts w:ascii="Courier New" w:hAnsi="Courier New"/>
-        </w:rPr>
-        <w:t>make deploy-functions</w:t>
-      </w:r>
-      <w:r>
-        <w:t xml:space="preserve"> : Mengompilasi dependensi local </w:t>
-      </w:r>
-      <w:r>
-        <w:rPr>
-          <w:rFonts w:ascii="Courier New" w:hAnsi="Courier New"/>
-        </w:rPr>
-        <w:t>requirements.txt</w:t>
-      </w:r>
-      <w:r>
-        <w:t xml:space="preserve"> dan mengunggah kode serverless ke Azure Function App.</w:t>
-      </w:r>
-    </w:p>
-    <w:p>
-      <w:pPr/>
-      <w:r>
-        <w:t xml:space="preserve">• </w:t>
-      </w:r>
-      <w:r>
-        <w:rPr>
-          <w:rFonts w:ascii="Courier New" w:hAnsi="Courier New"/>
-        </w:rPr>
-        <w:t>make upload-dashboard</w:t>
-      </w:r>
-      <w:r>
-        <w:t xml:space="preserve"> : Melakukan unggahan batch berkas frontend dasbor (</w:t>
-      </w:r>
-      <w:r>
-        <w:rPr>
-          <w:rFonts w:ascii="Courier New" w:hAnsi="Courier New"/>
-        </w:rPr>
-        <w:t>dashboard/</w:t>
-      </w:r>
-      <w:r>
-        <w:t xml:space="preserve">) langsung ke penampung </w:t>
-      </w:r>
-      <w:r>
-        <w:rPr>
-          <w:rFonts w:ascii="Courier New" w:hAnsi="Courier New"/>
-        </w:rPr>
-        <w:t>$web</w:t>
-      </w:r>
-      <w:r>
-        <w:t xml:space="preserve"> Blob Storage.</w:t>
-      </w:r>
-    </w:p>
-    <w:p>
-      <w:pPr/>
-      <w:r>
-        <w:t xml:space="preserve">• </w:t>
-      </w:r>
-      <w:r>
-        <w:rPr>
-          <w:rFonts w:ascii="Courier New" w:hAnsi="Courier New"/>
-        </w:rPr>
-        <w:t>make trigger-cloud</w:t>
-      </w:r>
-      <w:r>
-        <w:t xml:space="preserve">    : Menarik Master Key admin dari Azure Portal secara asinkron lalu mengirimkan request POST HTTP untuk memaksa pemicuan pipeline di cloud.</w:t>
-      </w:r>
-    </w:p>
-    <w:p>
-      <w:pPr/>
-      <w:r>
-        <w:t xml:space="preserve">• </w:t>
-      </w:r>
-      <w:r>
-        <w:rPr>
-          <w:rFonts w:ascii="Courier New" w:hAnsi="Courier New"/>
-        </w:rPr>
-        <w:t>make monitor-logs</w:t>
-      </w:r>
-      <w:r>
-        <w:t xml:space="preserve">     : Menjalankan kueri Kusto (KQL) ke Application Insights untuk menampilkan 30 jejak log eksekusi pipeline cloud terbaru langsung pada terminal lokal.</w:t>
-      </w:r>
-    </w:p>
-    <w:p>
-      <w:pPr/>
-      <w:r>
-        <w:t xml:space="preserve">• </w:t>
-      </w:r>
-      <w:r>
-        <w:rPr>
-          <w:rFonts w:ascii="Courier New" w:hAnsi="Courier New"/>
-        </w:rPr>
-        <w:t>make fix-cors</w:t>
-      </w:r>
-      <w:r>
-        <w:t xml:space="preserve">         : Mengatur ulang kebijakan akses CORS pada Storage Account dan Function App.</w:t>
-      </w:r>
-    </w:p>
-    <w:p>
-      <w:pPr/>
-      <w:r>
-        <w:t xml:space="preserve">• </w:t>
-      </w:r>
-      <w:r>
-        <w:rPr>
-          <w:rFonts w:ascii="Courier New" w:hAnsi="Courier New"/>
-        </w:rPr>
-        <w:t>make fix-msi</w:t>
-      </w:r>
-      <w:r>
-        <w:t xml:space="preserve">          : Mengotomatiskan pemberian hak Managed Identity pada tingkat Resource Group.</w:t>
-      </w:r>
-    </w:p>
-    <w:p>
-      <w:pPr>
-        <w:pStyle w:val="Heading3"/>
-      </w:pPr>
-      <w:r>
-        <w:t>6. Protokol Sinkronisasi Data (Opsi A - Hybrid Streaming)</w:t>
-      </w:r>
-    </w:p>
-    <w:p>
-      <w:pPr/>
-      <w:r>
-        <w:t xml:space="preserve">Untuk menjaga sinkronisasi data yang konsisten antara lokal, scraper, dan cloud data lake, ARM menggunakan model sinkronisasi hibrida: </w:t>
-      </w:r>
-      <w:r>
-        <w:rPr>
-          <w:rFonts w:ascii="Courier New" w:hAnsi="Courier New"/>
-        </w:rPr>
-      </w:r>
-      <w:r>
-        <w:rPr>
-          <w:rFonts w:ascii="Courier New" w:hAnsi="Courier New"/>
-        </w:rPr>
-        <w:t xml:space="preserve"> [Azure Functions Timer Trigger] │ ├── 1. Panggil scraper.py harian ➔ Tarik data terbaru dari web PIHPS Bank Indonesia │ ├── 2. Ambil berkas JSON tahun berjalan (2026.json) dari privat Blob Storage │ ├── 3. Lakukan append baris harga baru ➔ Unggah kembali berkas 2026.json ke Data Lake Privat │ ├── 4. Muat seluruh berkas historis (2021.json s/d 2026.json) ke memori RAM Functions │ ├── 5. Lakukan deteksi anomali statistik Z-Score harian │ ├── 6. Jalankan pemodelan latih ulang Prophet (84 model) secara paralel di RAM │ ├── 7. Kompresi seluruh data analisis dan simpan sebagai dashboard_data.json (~1.2 MB) │ ├── 8. Unggah dashboard_data.json ke container publik $web Blob Storage │ └── 9. Kirim ringkasan peringatan taktis ke Telegram &amp; metrik evaluasi ke Azure ML Studio </w:t>
-      </w:r>
-      <w:r>
-        <w:rPr>
-          <w:rFonts w:ascii="Courier New" w:hAnsi="Courier New"/>
-        </w:rPr>
-      </w:r>
-    </w:p>
-    <w:p>
-      <w:pPr>
-        <w:pStyle w:val="Heading3"/>
-      </w:pPr>
-      <w:r>
-        <w:t>7. Bukti Dokumentasi Visual Azure (Screenshots)</w:t>
-      </w:r>
-    </w:p>
-    <w:p>
-      <w:pPr/>
-      <w:r>
-        <w:t>Untuk memberikan validasi nyata kepada juri bahwa infrastruktur cloud ARM telah berjalan 100% aktif dan terintegrasi di server Microsoft Azure, berikut adalah bukti tangkapan layar sistem yang harus disematkan:</w:t>
+        <w:t>Tangkapan layar visualisasi workflow GitHub Actions yang sukses deploy ke Azure Static Web Apps.</w:t>
       </w:r>
     </w:p>
     <w:p>
       <w:pPr>
         <w:pStyle w:val="Heading4"/>
-      </w:pPr>
-      <w:r>
-        <w:t>A. Pelacakan Eksperimen Azure ML Studio (MLflow)</w:t>
-      </w:r>
-    </w:p>
-    <w:p>
-      <w:pPr/>
-      <w:r>
-        <w:t>Menampilkan daftar Parent Run harian dengan nested Child Runs untuk 84 model Prophet, lengkap dengan pencatatan parameter komoditas dan metrik evaluasi (MAPE/MAE/RMSE):</w:t>
-      </w:r>
-    </w:p>
-    <w:p>
-      <w:pPr/>
-      <w:r>
-        <w:rPr>
-          <w:i/>
-        </w:rPr>
-        <w:t>[Gambar: Azure ML Studio - MLflow Run History - Path: docs/images/azure_mlflow_runs.png]</w:t>
-      </w:r>
-    </w:p>
-    <w:p>
-      <w:pPr/>
-      <w:r>
-        <w:rPr>
-          <w:i/>
-        </w:rPr>
-        <w:t>Tangkapan layar workspace Azure ML Studio yang menunjukkan visualisasi performa run model.</w:t>
-      </w:r>
-    </w:p>
-    <w:p>
-      <w:pPr>
-        <w:pStyle w:val="Heading4"/>
-      </w:pPr>
-      <w:r>
-        <w:t>B. Eksekusi Serverless Azure Functions</w:t>
-      </w:r>
-    </w:p>
-    <w:p>
-      <w:pPr/>
-      <w:r>
-        <w:t xml:space="preserve">Menampilkan log eksekusi berkala dari timer trigger </w:t>
-      </w:r>
-      <w:r>
-        <w:rPr>
-          <w:rFonts w:ascii="Courier New" w:hAnsi="Courier New"/>
-        </w:rPr>
-        <w:t>arm_daily_pipeline</w:t>
-      </w:r>
-      <w:r>
-        <w:t xml:space="preserve"> yang berhasil melakukan scraping data PIHPS, kalkulasi modeling di RAM, dan pengiriman alert Telegram:</w:t>
-      </w:r>
-    </w:p>
-    <w:p>
-      <w:pPr/>
-      <w:r>
-        <w:rPr>
-          <w:i/>
-        </w:rPr>
-        <w:t>[Gambar: Azure Functions - Daily Pipeline Execution Logs - Path: docs/images/azure_functions_logs.png]</w:t>
-      </w:r>
-    </w:p>
-    <w:p>
-      <w:pPr/>
-      <w:r>
-        <w:rPr>
-          <w:i/>
-        </w:rPr>
-        <w:t>Tangkapan layar log eksekusi Azure Functions pada Application Insights.</w:t>
-      </w:r>
-    </w:p>
-    <w:p>
-      <w:pPr>
-        <w:pStyle w:val="Heading4"/>
-      </w:pPr>
-      <w:r>
-        <w:t>C. Penampung Data Lake Azure Blob Storage</w:t>
-      </w:r>
-    </w:p>
-    <w:p>
-      <w:pPr/>
-      <w:r>
-        <w:t>Menampilkan file JSON data mentah tahunan privat (</w:t>
-      </w:r>
-      <w:r>
-        <w:rPr>
-          <w:rFonts w:ascii="Courier New" w:hAnsi="Courier New"/>
-        </w:rPr>
-        <w:t>arm-raw-data</w:t>
-      </w:r>
-      <w:r>
-        <w:t>) dan file serving dasbor publik (</w:t>
-      </w:r>
-      <w:r>
-        <w:rPr>
-          <w:rFonts w:ascii="Courier New" w:hAnsi="Courier New"/>
-        </w:rPr>
-        <w:t>$web/dashboard_data.json</w:t>
-      </w:r>
-      <w:r>
-        <w:t>):</w:t>
-      </w:r>
-    </w:p>
-    <w:p>
-      <w:pPr/>
-      <w:r>
-        <w:rPr>
-          <w:i/>
-        </w:rPr>
-        <w:t>[Gambar: Azure Storage Explorer - Blob Data Lake - Path: docs/images/azure_storage_containers.png]</w:t>
-      </w:r>
-    </w:p>
-    <w:p>
-      <w:pPr/>
-      <w:r>
-        <w:rPr>
-          <w:i/>
-        </w:rPr>
-        <w:t>Tangkapan layar struktur container Blob Storage pada Azure Portal.</w:t>
-      </w:r>
-    </w:p>
-    <w:p>
-      <w:pPr>
-        <w:pStyle w:val="Heading4"/>
-      </w:pPr>
-      <w:r>
-        <w:t>D. Jalur Integrasi CI/CD GitHub Actions</w:t>
-      </w:r>
-    </w:p>
-    <w:p>
-      <w:pPr/>
-      <w:r>
-        <w:t>Menampilkan rekam jejak otomatisasi deploy frontend dasbor yang terhubung secara realtime dengan repositori GitHub:</w:t>
-      </w:r>
-    </w:p>
-    <w:p>
-      <w:pPr/>
-      <w:r>
-        <w:rPr>
-          <w:i/>
-        </w:rPr>
-        <w:t>[Gambar: GitHub Actions - CI/CD Workflow for SWA - Path: docs/images/github_actions_workflow.png]</w:t>
-      </w:r>
-    </w:p>
-    <w:p>
-      <w:pPr/>
-      <w:r>
-        <w:rPr>
-          <w:i/>
-        </w:rPr>
-        <w:t>Tangkapan layar visualisasi workflow GitHub Actions yang sukses deploy ke Azure Static Web Apps.</w:t>
-      </w:r>
-    </w:p>
-    <w:p>
-      <w:pPr>
-        <w:pStyle w:val="Heading3"/>
       </w:pPr>
       <w:r>
         <w:t>8. Justifikasi Pemilihan Azure vs AWS/GCP</w:t>
@@ -4003,7 +4086,7 @@
     </w:tbl>
     <w:p>
       <w:pPr>
-        <w:pStyle w:val="Heading3"/>
+        <w:pStyle w:val="Heading4"/>
       </w:pPr>
       <w:r>
         <w:t>9. Estimasi Biaya (Zero-Cost Infrastructure)</w:t>
@@ -4414,7 +4497,7 @@
     </w:tbl>
     <w:p>
       <w:pPr>
-        <w:pStyle w:val="Heading3"/>
+        <w:pStyle w:val="Heading4"/>
       </w:pPr>
       <w:r>
         <w:t>10. Skalabilitas &amp; Rencana Ekspansi (34 Provinsi)</w:t>
@@ -4769,14 +4852,16 @@
     </w:p>
     <w:p>
       <w:pPr>
-        <w:pStyle w:val="Heading3"/>
+        <w:pStyle w:val="Heading4"/>
       </w:pPr>
       <w:r>
         <w:t>🌐 Akses Platform</w:t>
       </w:r>
     </w:p>
     <w:p>
-      <w:pPr/>
+      <w:pPr>
+        <w:pStyle w:val="ListParagraph"/>
+      </w:pPr>
       <w:r>
         <w:t xml:space="preserve">• </w:t>
       </w:r>
@@ -4791,7 +4876,9 @@
       </w:r>
     </w:p>
     <w:p>
-      <w:pPr/>
+      <w:pPr>
+        <w:pStyle w:val="ListParagraph"/>
+      </w:pPr>
       <w:r>
         <w:t xml:space="preserve">• </w:t>
       </w:r>
@@ -4816,7 +4903,7 @@
     </w:p>
     <w:p>
       <w:pPr>
-        <w:pStyle w:val="Heading3"/>
+        <w:pStyle w:val="Heading4"/>
       </w:pPr>
       <w:r>
         <w:t>🚶‍♂️ Alur Penggunaan Dasbor (Step-by-Step)</w:t>
@@ -4824,14 +4911,16 @@
     </w:p>
     <w:p>
       <w:pPr>
-        <w:pStyle w:val="Heading4"/>
+        <w:pStyle w:val="Heading5"/>
       </w:pPr>
       <w:r>
         <w:t>1. Pemantauan Makro (Tab "Executive")</w:t>
       </w:r>
     </w:p>
     <w:p>
-      <w:pPr/>
+      <w:pPr>
+        <w:pStyle w:val="ListParagraph"/>
+      </w:pPr>
       <w:r>
         <w:t xml:space="preserve">• </w:t>
       </w:r>
@@ -4855,7 +4944,9 @@
       </w:r>
     </w:p>
     <w:p>
-      <w:pPr/>
+      <w:pPr>
+        <w:pStyle w:val="ListParagraph"/>
+      </w:pPr>
       <w:r>
         <w:t xml:space="preserve">• </w:t>
       </w:r>
@@ -4870,7 +4961,9 @@
       </w:r>
     </w:p>
     <w:p>
-      <w:pPr/>
+      <w:pPr>
+        <w:pStyle w:val="ListParagraph"/>
+      </w:pPr>
       <w:r>
         <w:t xml:space="preserve">• </w:t>
       </w:r>
@@ -4912,7 +5005,9 @@
       </w:r>
     </w:p>
     <w:p>
-      <w:pPr/>
+      <w:pPr>
+        <w:pStyle w:val="ListParagraph"/>
+      </w:pPr>
       <w:r>
         <w:t xml:space="preserve">• </w:t>
       </w:r>
@@ -4937,14 +5032,16 @@
     </w:p>
     <w:p>
       <w:pPr>
-        <w:pStyle w:val="Heading4"/>
+        <w:pStyle w:val="Heading5"/>
       </w:pPr>
       <w:r>
         <w:t>2. Analisis Spasial &amp; Peluang Arbitrase (Tab "Spatial")</w:t>
       </w:r>
     </w:p>
     <w:p>
-      <w:pPr/>
+      <w:pPr>
+        <w:pStyle w:val="ListParagraph"/>
+      </w:pPr>
       <w:r>
         <w:t xml:space="preserve">• </w:t>
       </w:r>
@@ -4968,7 +5065,9 @@
       </w:r>
     </w:p>
     <w:p>
-      <w:pPr/>
+      <w:pPr>
+        <w:pStyle w:val="ListParagraph"/>
+      </w:pPr>
       <w:r>
         <w:t xml:space="preserve">• </w:t>
       </w:r>
@@ -5001,7 +5100,9 @@
       </w:r>
     </w:p>
     <w:p>
-      <w:pPr/>
+      <w:pPr>
+        <w:pStyle w:val="ListParagraph"/>
+      </w:pPr>
       <w:r>
         <w:t xml:space="preserve">• </w:t>
       </w:r>
@@ -5043,7 +5144,9 @@
       </w:r>
     </w:p>
     <w:p>
-      <w:pPr/>
+      <w:pPr>
+        <w:pStyle w:val="ListParagraph"/>
+      </w:pPr>
       <w:r>
         <w:t xml:space="preserve">• </w:t>
       </w:r>
@@ -5068,14 +5171,16 @@
     </w:p>
     <w:p>
       <w:pPr>
-        <w:pStyle w:val="Heading4"/>
+        <w:pStyle w:val="Heading5"/>
       </w:pPr>
       <w:r>
         <w:t>3. Audit Rantai Pasokan &amp; Deteksi Spekulan (Tab "Margin")</w:t>
       </w:r>
     </w:p>
     <w:p>
-      <w:pPr/>
+      <w:pPr>
+        <w:pStyle w:val="ListParagraph"/>
+      </w:pPr>
       <w:r>
         <w:t xml:space="preserve">• </w:t>
       </w:r>
@@ -5099,7 +5204,9 @@
       </w:r>
     </w:p>
     <w:p>
-      <w:pPr/>
+      <w:pPr>
+        <w:pStyle w:val="ListParagraph"/>
+      </w:pPr>
       <w:r>
         <w:t xml:space="preserve">• </w:t>
       </w:r>
@@ -5150,7 +5257,9 @@
       </w:r>
     </w:p>
     <w:p>
-      <w:pPr/>
+      <w:pPr>
+        <w:pStyle w:val="ListParagraph"/>
+      </w:pPr>
       <w:r>
         <w:t xml:space="preserve">• </w:t>
       </w:r>
@@ -5183,7 +5292,9 @@
       </w:r>
     </w:p>
     <w:p>
-      <w:pPr/>
+      <w:pPr>
+        <w:pStyle w:val="ListParagraph"/>
+      </w:pPr>
       <w:r>
         <w:t xml:space="preserve">• </w:t>
       </w:r>
@@ -5199,14 +5310,16 @@
     </w:p>
     <w:p>
       <w:pPr>
-        <w:pStyle w:val="Heading4"/>
+        <w:pStyle w:val="Heading5"/>
       </w:pPr>
       <w:r>
         <w:t>4. Proyeksi Inflasi 90 Hari ke Depan (Tab "ML EWS")</w:t>
       </w:r>
     </w:p>
     <w:p>
-      <w:pPr/>
+      <w:pPr>
+        <w:pStyle w:val="ListParagraph"/>
+      </w:pPr>
       <w:r>
         <w:t xml:space="preserve">• </w:t>
       </w:r>
@@ -5230,7 +5343,9 @@
       </w:r>
     </w:p>
     <w:p>
-      <w:pPr/>
+      <w:pPr>
+        <w:pStyle w:val="ListParagraph"/>
+      </w:pPr>
       <w:r>
         <w:t xml:space="preserve">• </w:t>
       </w:r>
@@ -5254,7 +5369,9 @@
       </w:r>
     </w:p>
     <w:p>
-      <w:pPr/>
+      <w:pPr>
+        <w:pStyle w:val="ListParagraph"/>
+      </w:pPr>
       <w:r>
         <w:t xml:space="preserve">• </w:t>
       </w:r>
@@ -5269,7 +5386,9 @@
       </w:r>
     </w:p>
     <w:p>
-      <w:pPr/>
+      <w:pPr>
+        <w:pStyle w:val="ListParagraph"/>
+      </w:pPr>
       <w:r>
         <w:t xml:space="preserve">• </w:t>
       </w:r>
@@ -5293,7 +5412,9 @@
       </w:r>
     </w:p>
     <w:p>
-      <w:pPr/>
+      <w:pPr>
+        <w:pStyle w:val="ListParagraph"/>
+      </w:pPr>
       <w:r>
         <w:t xml:space="preserve">• </w:t>
       </w:r>
@@ -5372,365 +5493,397 @@
     </w:p>
     <w:p>
       <w:pPr>
-        <w:pStyle w:val="Heading3"/>
+        <w:pStyle w:val="Heading4"/>
       </w:pPr>
       <w:r>
         <w:t>Studi Kasus Pengguna</w:t>
       </w:r>
     </w:p>
     <w:p>
+      <w:pPr>
+        <w:pStyle w:val="ListParagraph"/>
+      </w:pPr>
+      <w:r>
+        <w:t xml:space="preserve">• </w:t>
+      </w:r>
+      <w:r>
+        <w:rPr>
+          <w:b/>
+        </w:rPr>
+        <w:t>Kasus:</w:t>
+      </w:r>
+      <w:r>
+        <w:t xml:space="preserve"> Pemantauan Harga Daging Sapi Kualitas 1 di Banda Aceh Menjelang Tradisi Meugang (Juni 2026).</w:t>
+      </w:r>
+    </w:p>
+    <w:p>
+      <w:pPr>
+        <w:pStyle w:val="ListParagraph"/>
+      </w:pPr>
+      <w:r>
+        <w:t xml:space="preserve">• </w:t>
+      </w:r>
+      <w:r>
+        <w:rPr>
+          <w:b/>
+        </w:rPr>
+        <w:t>Permasalahan:</w:t>
+      </w:r>
+      <w:r>
+        <w:t xml:space="preserve"> Menjelang hari besar keagamaan, terjadi lonjakan harga daging sapi yang sangat tinggi di pasar-pasar tradisional Kota Banda Aceh. TPID Kota Banda Aceh perlu mengidentifikasi apakah lonjakan harga ini wajar akibat peningkatan permintaan (</w:t>
+      </w:r>
+      <w:r>
+        <w:rPr>
+          <w:i/>
+        </w:rPr>
+        <w:t>demand shock</w:t>
+      </w:r>
+      <w:r>
+        <w:t>) atau disebabkan oleh penimbunan stok (</w:t>
+      </w:r>
+      <w:r>
+        <w:rPr>
+          <w:i/>
+        </w:rPr>
+        <w:t>supply hoarding</w:t>
+      </w:r>
+      <w:r>
+        <w:t>) di tingkat pedagang eceran.</w:t>
+      </w:r>
+    </w:p>
+    <w:p>
+      <w:pPr>
+        <w:pStyle w:val="ListParagraph"/>
+      </w:pPr>
+      <w:r>
+        <w:t xml:space="preserve">• </w:t>
+      </w:r>
+      <w:r>
+        <w:rPr>
+          <w:b/>
+        </w:rPr>
+        <w:t>Langkah Analisis Menggunakan ARM:</w:t>
+      </w:r>
+    </w:p>
+    <w:p>
+      <w:pPr>
+        <w:pStyle w:val="ListParagraph"/>
+      </w:pPr>
+      <w:r>
+        <w:t xml:space="preserve">1. </w:t>
+      </w:r>
+      <w:r>
+        <w:rPr>
+          <w:b/>
+        </w:rPr>
+        <w:t>Identifikasi Anomali (Tab Executive):</w:t>
+      </w:r>
+      <w:r>
+        <w:t xml:space="preserve"> Z-Score harian pada dashboard mendeteksi deviasi harga daging sapi menyimpang hingga </w:t>
+      </w:r>
+      <w:r>
+        <w:rPr>
+          <w:b/>
+        </w:rPr>
+        <w:t>+16.1%</w:t>
+      </w:r>
+      <w:r>
+        <w:t xml:space="preserve"> dari rata-rata bulanan (MA30). Status komoditas berubah menjadi </w:t>
+      </w:r>
+      <w:r>
+        <w:rPr>
+          <w:i/>
+        </w:rPr>
+        <w:t>Waspada</w:t>
+      </w:r>
+      <w:r>
+        <w:t>.</w:t>
+      </w:r>
+    </w:p>
+    <w:p>
+      <w:pPr>
+        <w:pStyle w:val="ListParagraph"/>
+      </w:pPr>
+      <w:r>
+        <w:t xml:space="preserve">2. </w:t>
+      </w:r>
+      <w:r>
+        <w:rPr>
+          <w:b/>
+        </w:rPr>
+        <w:t>Audit Rantai Pasok (Tab Margin):</w:t>
+      </w:r>
+      <w:r>
+        <w:t xml:space="preserve"> Peneliti TPID mengecek diagram alur rantai distribusi. Ditemukan harga di tingkat Pedagang Besar (Grosir/Distributor) adalah </w:t>
+      </w:r>
+      <w:r>
+        <w:rPr>
+          <w:rFonts w:ascii="Courier New" w:hAnsi="Courier New"/>
+        </w:rPr>
+        <w:t>Rp 165.000</w:t>
+      </w:r>
+      <w:r>
+        <w:t xml:space="preserve"> sedangkan di Pasar Tradisional (Eceran) adalah </w:t>
+      </w:r>
+      <w:r>
+        <w:rPr>
+          <w:rFonts w:ascii="Courier New" w:hAnsi="Courier New"/>
+        </w:rPr>
+        <w:t>Rp 170.000</w:t>
+      </w:r>
+      <w:r>
+        <w:t>.</w:t>
+      </w:r>
+    </w:p>
+    <w:p>
+      <w:pPr>
+        <w:pStyle w:val="ListParagraph"/>
+      </w:pPr>
+      <w:r>
+        <w:t xml:space="preserve">3. </w:t>
+      </w:r>
+      <w:r>
+        <w:rPr>
+          <w:b/>
+        </w:rPr>
+        <w:t>Kalkulasi Margin:</w:t>
+      </w:r>
+    </w:p>
+    <w:p>
       <w:pPr/>
       <w:r>
-        <w:t xml:space="preserve">• </w:t>
-      </w:r>
-      <w:r>
-        <w:rPr>
-          <w:b/>
-        </w:rPr>
-        <w:t>Kasus:</w:t>
-      </w:r>
-      <w:r>
-        <w:t xml:space="preserve"> Pemantauan Harga Daging Sapi Kualitas 1 di Banda Aceh Menjelang Tradisi Meugang (Juni 2026).</w:t>
+        <w:t>$$\text{Margin Keuntungan Eceran} = \frac{170.000 - 165.000}{165.000} \times 100\% = \mathbf{3.03\%}$$</w:t>
+      </w:r>
+    </w:p>
+    <w:p>
+      <w:pPr>
+        <w:pStyle w:val="ListParagraph"/>
+      </w:pPr>
+      <w:r>
+        <w:t xml:space="preserve">1. </w:t>
+      </w:r>
+      <w:r>
+        <w:rPr>
+          <w:b/>
+        </w:rPr>
+        <w:t>Rekomendasi Kebijakan:</w:t>
+      </w:r>
+      <w:r>
+        <w:t xml:space="preserve"> Karena margin pedagang eceran sangat tipis (hanya 3.03% atau selisih Rp 5.000/kg), TPID menyimpulkan </w:t>
+      </w:r>
+      <w:r>
+        <w:rPr>
+          <w:b/>
+        </w:rPr>
+        <w:t>rantai pasok retail sangat sehat dan efisien</w:t>
+      </w:r>
+      <w:r>
+        <w:t>; kenaikan harga murni didorong oleh guncangan permintaan musiman (Meugang) di tingkat grosir/hulu, bukan spekulan retail.</w:t>
+      </w:r>
+    </w:p>
+    <w:p>
+      <w:pPr>
+        <w:pStyle w:val="ListParagraph"/>
+      </w:pPr>
+      <w:r>
+        <w:t xml:space="preserve">2. </w:t>
+      </w:r>
+      <w:r>
+        <w:rPr>
+          <w:b/>
+        </w:rPr>
+        <w:t>Aksi Nyata:</w:t>
+      </w:r>
+      <w:r>
+        <w:t xml:space="preserve"> Satgas Pangan tidak perlu melakukan razia/sidak di tingkat pasar tradisional, melainkan berfokus mendistribusikan subsidi logistik pengangkutan hewan ternak dari peternak surplus di Lhokseumawe ke distributor Banda Aceh guna meredam harga grosir.</w:t>
+      </w:r>
+    </w:p>
+    <w:p>
+      <w:pPr>
+        <w:pStyle w:val="Heading4"/>
+      </w:pPr>
+      <w:r>
+        <w:t>Rencana Pengembangan ke Depan (Future Roadmap)</w:t>
+      </w:r>
+    </w:p>
+    <w:p>
+      <w:pPr>
+        <w:pStyle w:val="ListParagraph"/>
+      </w:pPr>
+      <w:r>
+        <w:t xml:space="preserve">• </w:t>
+      </w:r>
+      <w:r>
+        <w:rPr>
+          <w:b/>
+        </w:rPr>
+        <w:t>FASE 1: Pilot Project TPID (Q3 2026):</w:t>
+      </w:r>
+      <w:r>
+        <w:t xml:space="preserve"> Uji coba operasional dasbor di lingkungan Satgas Pangan &amp; TPID Provinsi Aceh untuk menyelaraskan alur kerja taktis.</w:t>
+      </w:r>
+    </w:p>
+    <w:p>
+      <w:pPr>
+        <w:pStyle w:val="ListParagraph"/>
+      </w:pPr>
+      <w:r>
+        <w:t xml:space="preserve">• </w:t>
+      </w:r>
+      <w:r>
+        <w:rPr>
+          <w:b/>
+        </w:rPr>
+        <w:t>FASE 2: Analisis Korelasi Lintas Pangan (Q4 2026):</w:t>
+      </w:r>
+      <w:r>
+        <w:t xml:space="preserve"> Pendeteksian rambatan inflasi antarkomoditas (misal: kenaikan harga pakan jagung ➔ efek domino 7 hari kemudian pada komoditas telur dan daging ayam).</w:t>
+      </w:r>
+    </w:p>
+    <w:p>
+      <w:pPr>
+        <w:pStyle w:val="ListParagraph"/>
+      </w:pPr>
+      <w:r>
+        <w:t xml:space="preserve">• </w:t>
+      </w:r>
+      <w:r>
+        <w:rPr>
+          <w:b/>
+        </w:rPr>
+        <w:t>FASE 3: Machine Learning Multivariat (Q1 2027):</w:t>
+      </w:r>
+      <w:r>
+        <w:t xml:space="preserve"> Integrasi data cuaca curah hujan dari BMKG API, data produksi lokal, serta fluktuasi biaya BBM transportasi ke model ML multivariat (seperti Prophet Multivariat atau XGBoost).</w:t>
+      </w:r>
+    </w:p>
+    <w:p>
+      <w:pPr>
+        <w:pStyle w:val="Heading4"/>
+      </w:pPr>
+      <w:r>
+        <w:t>Tim dan Peran Masing-Masing Anggota</w:t>
+      </w:r>
+    </w:p>
+    <w:p>
+      <w:pPr>
+        <w:pStyle w:val="ListParagraph"/>
+      </w:pPr>
+      <w:r>
+        <w:t xml:space="preserve">• </w:t>
+      </w:r>
+      <w:r>
+        <w:rPr>
+          <w:b/>
+        </w:rPr>
+        <w:t>Aulia Muzhaffar (ML &amp; Azure Specialist):</w:t>
+      </w:r>
+      <w:r>
+        <w:t xml:space="preserve"> Mengembangkan model Prophet, evaluasi baseline holdout, setup eksperimen MLflow, mendesain serverless pipeline Azure Functions, mengimplementasikan pengujian hipotesis statistik, serta menyusun storytelling analisis.</w:t>
+      </w:r>
+    </w:p>
+    <w:p>
+      <w:pPr>
+        <w:pStyle w:val="ListParagraph"/>
+      </w:pPr>
+      <w:r>
+        <w:t xml:space="preserve">• </w:t>
+      </w:r>
+      <w:r>
+        <w:rPr>
+          <w:b/>
+        </w:rPr>
+        <w:t>Muhammad Ilhaam Ghiffari (Data Engineer &amp; Frontend Developer):</w:t>
+      </w:r>
+      <w:r>
+        <w:t xml:space="preserve"> Melakukan refactoring modular script ETL, mengembangkan modul deteksi anomali Z-score, mendesain visualisasi dark glassmorphism dashboard, merancang kompresi data JSON, dan mengamankan environment lokal.</w:t>
+      </w:r>
+    </w:p>
+    <w:p>
+      <w:pPr>
+        <w:pStyle w:val="ListParagraph"/>
+      </w:pPr>
+      <w:r>
+        <w:t xml:space="preserve">• </w:t>
+      </w:r>
+      <w:r>
+        <w:rPr>
+          <w:b/>
+        </w:rPr>
+        <w:t>Arief Hidayah (QA Auditor, Repo Manager &amp; Storyteller):</w:t>
+      </w:r>
+      <w:r>
+        <w:t xml:space="preserve"> Membuat scraper data harian PIHPS, menulis suite pengujian otomatis pytest (74 test cases), menganalisis error model, menyusun bot integrasi notifikasi Telegram, dan mengelola sinkronisasi repositori.</w:t>
+      </w:r>
+    </w:p>
+    <w:p>
+      <w:pPr>
+        <w:pStyle w:val="Heading4"/>
+      </w:pPr>
+      <w:r>
+        <w:t>Kualitas Kode &amp; Penjaminan Mutu (QA)</w:t>
       </w:r>
     </w:p>
     <w:p>
       <w:pPr/>
       <w:r>
-        <w:t xml:space="preserve">• </w:t>
-      </w:r>
-      <w:r>
-        <w:rPr>
-          <w:b/>
-        </w:rPr>
-        <w:t>Permasalahan:</w:t>
-      </w:r>
-      <w:r>
-        <w:t xml:space="preserve"> Menjelang hari besar keagamaan, terjadi lonjakan harga daging sapi yang sangat tinggi di pasar-pasar tradisional Kota Banda Aceh. TPID Kota Banda Aceh perlu mengidentifikasi apakah lonjakan harga ini wajar akibat peningkatan permintaan (</w:t>
+        <w:t xml:space="preserve">Repositori ini memiliki </w:t>
+      </w:r>
+      <w:r>
+        <w:rPr>
+          <w:b/>
+        </w:rPr>
+        <w:t>74 unit tests otomatis</w:t>
+      </w:r>
+      <w:r>
+        <w:t xml:space="preserve"> yang mencakup pengujian fungsional dari modul ETL, kalkulasi statistik Z-score, peramalan Prophet, sanitasi JSON, scraper web, notifikasi Telegram, dan evaluasi model baseline. Pengujian dijalankan otomatis via pytest.</w:t>
+      </w:r>
+    </w:p>
+    <w:p>
+      <w:pPr>
+        <w:pStyle w:val="Heading4"/>
+      </w:pPr>
+      <w:r>
+        <w:t>Risiko dan Mitigasi</w:t>
+      </w:r>
+    </w:p>
+    <w:p>
+      <w:pPr>
+        <w:pStyle w:val="ListParagraph"/>
+      </w:pPr>
+      <w:r>
+        <w:t xml:space="preserve">• </w:t>
       </w:r>
       <w:r>
         <w:rPr>
           <w:i/>
         </w:rPr>
-        <w:t>demand shock</w:t>
-      </w:r>
-      <w:r>
-        <w:t>) atau disebabkan oleh penimbunan stok (</w:t>
+        <w:t>Risiko False Negative:</w:t>
+      </w:r>
+      <w:r>
+        <w:t xml:space="preserve"> Mitigasi dilakukan dengan menetapkan batas Z-score waspada yang cukup sensitif ($2\sigma$) dan selalu menyertakan bayangan area keyakinan prediksi.</w:t>
+      </w:r>
+    </w:p>
+    <w:p>
+      <w:pPr>
+        <w:pStyle w:val="ListParagraph"/>
+      </w:pPr>
+      <w:r>
+        <w:t xml:space="preserve">• </w:t>
       </w:r>
       <w:r>
         <w:rPr>
           <w:i/>
         </w:rPr>
-        <w:t>supply hoarding</w:t>
-      </w:r>
-      <w:r>
-        <w:t>) di tingkat pedagang eceran.</w:t>
-      </w:r>
-    </w:p>
-    <w:p>
-      <w:pPr/>
-      <w:r>
-        <w:t xml:space="preserve">• </w:t>
-      </w:r>
-      <w:r>
-        <w:rPr>
-          <w:b/>
-        </w:rPr>
-        <w:t>Langkah Analisis Menggunakan ARM:</w:t>
-      </w:r>
-    </w:p>
-    <w:p>
-      <w:pPr/>
-      <w:r>
-        <w:t xml:space="preserve">1. </w:t>
-      </w:r>
-      <w:r>
-        <w:rPr>
-          <w:b/>
-        </w:rPr>
-        <w:t>Identifikasi Anomali (Tab Executive):</w:t>
-      </w:r>
-      <w:r>
-        <w:t xml:space="preserve"> Z-Score harian pada dashboard mendeteksi deviasi harga daging sapi menyimpang hingga </w:t>
-      </w:r>
-      <w:r>
-        <w:rPr>
-          <w:b/>
-        </w:rPr>
-        <w:t>+16.1%</w:t>
-      </w:r>
-      <w:r>
-        <w:t xml:space="preserve"> dari rata-rata bulanan (MA30). Status komoditas berubah menjadi </w:t>
+        <w:t>Risiko Server down pada Sumber Data:</w:t>
+      </w:r>
+      <w:r>
+        <w:t xml:space="preserve"> Azure Functions dilengkapi penanganan pengecualian (</w:t>
       </w:r>
       <w:r>
         <w:rPr>
           <w:i/>
         </w:rPr>
-        <w:t>Waspada</w:t>
-      </w:r>
-      <w:r>
-        <w:t>.</w:t>
-      </w:r>
-    </w:p>
-    <w:p>
-      <w:pPr/>
-      <w:r>
-        <w:t xml:space="preserve">2. </w:t>
-      </w:r>
-      <w:r>
-        <w:rPr>
-          <w:b/>
-        </w:rPr>
-        <w:t>Audit Rantai Pasok (Tab Margin):</w:t>
-      </w:r>
-      <w:r>
-        <w:t xml:space="preserve"> Peneliti TPID mengecek diagram alur rantai distribusi. Ditemukan harga di tingkat Pedagang Besar (Grosir/Distributor) adalah </w:t>
-      </w:r>
-      <w:r>
-        <w:rPr>
-          <w:rFonts w:ascii="Courier New" w:hAnsi="Courier New"/>
-        </w:rPr>
-        <w:t>Rp 165.000</w:t>
-      </w:r>
-      <w:r>
-        <w:t xml:space="preserve"> sedangkan di Pasar Tradisional (Eceran) adalah </w:t>
-      </w:r>
-      <w:r>
-        <w:rPr>
-          <w:rFonts w:ascii="Courier New" w:hAnsi="Courier New"/>
-        </w:rPr>
-        <w:t>Rp 170.000</w:t>
-      </w:r>
-      <w:r>
-        <w:t>.</w:t>
-      </w:r>
-    </w:p>
-    <w:p>
-      <w:pPr/>
-      <w:r>
-        <w:t xml:space="preserve">3. </w:t>
-      </w:r>
-      <w:r>
-        <w:rPr>
-          <w:b/>
-        </w:rPr>
-        <w:t>Kalkulasi Margin:</w:t>
-      </w:r>
-    </w:p>
-    <w:p>
-      <w:pPr/>
-      <w:r>
-        <w:t>$$\text{Margin Keuntungan Eceran} = \frac{170.000 - 165.000}{165.000} \times 100\% = \mathbf{3.03\%}$$</w:t>
-      </w:r>
-    </w:p>
-    <w:p>
-      <w:pPr/>
-      <w:r>
-        <w:t xml:space="preserve">1. </w:t>
-      </w:r>
-      <w:r>
-        <w:rPr>
-          <w:b/>
-        </w:rPr>
-        <w:t>Rekomendasi Kebijakan:</w:t>
-      </w:r>
-      <w:r>
-        <w:t xml:space="preserve"> Karena margin pedagang eceran sangat tipis (hanya 3.03% atau selisih Rp 5.000/kg), TPID menyimpulkan </w:t>
-      </w:r>
-      <w:r>
-        <w:rPr>
-          <w:b/>
-        </w:rPr>
-        <w:t>rantai pasok retail sangat sehat dan efisien</w:t>
-      </w:r>
-      <w:r>
-        <w:t>; kenaikan harga murni didorong oleh guncangan permintaan musiman (Meugang) di tingkat grosir/hulu, bukan spekulan retail.</w:t>
-      </w:r>
-    </w:p>
-    <w:p>
-      <w:pPr/>
-      <w:r>
-        <w:t xml:space="preserve">2. </w:t>
-      </w:r>
-      <w:r>
-        <w:rPr>
-          <w:b/>
-        </w:rPr>
-        <w:t>Aksi Nyata:</w:t>
-      </w:r>
-      <w:r>
-        <w:t xml:space="preserve"> Satgas Pangan tidak perlu melakukan razia/sidak di tingkat pasar tradisional, melainkan berfokus mendistribusikan subsidi logistik pengangkutan hewan ternak dari peternak surplus di Lhokseumawe ke distributor Banda Aceh guna meredam harga grosir.</w:t>
-      </w:r>
-    </w:p>
-    <w:p>
-      <w:pPr>
-        <w:pStyle w:val="Heading3"/>
-      </w:pPr>
-      <w:r>
-        <w:t>Rencana Pengembangan ke Depan (Future Roadmap)</w:t>
-      </w:r>
-    </w:p>
-    <w:p>
-      <w:pPr/>
-      <w:r>
-        <w:t xml:space="preserve">• </w:t>
-      </w:r>
-      <w:r>
-        <w:rPr>
-          <w:b/>
-        </w:rPr>
-        <w:t>FASE 1: Pilot Project TPID (Q3 2026):</w:t>
-      </w:r>
-      <w:r>
-        <w:t xml:space="preserve"> Uji coba operasional dasbor di lingkungan Satgas Pangan &amp; TPID Provinsi Aceh untuk menyelaraskan alur kerja taktis.</w:t>
-      </w:r>
-    </w:p>
-    <w:p>
-      <w:pPr/>
-      <w:r>
-        <w:t xml:space="preserve">• </w:t>
-      </w:r>
-      <w:r>
-        <w:rPr>
-          <w:b/>
-        </w:rPr>
-        <w:t>FASE 2: Analisis Korelasi Lintas Pangan (Q4 2026):</w:t>
-      </w:r>
-      <w:r>
-        <w:t xml:space="preserve"> Pendeteksian rambatan inflasi antarkomoditas (misal: kenaikan harga pakan jagung ➔ efek domino 7 hari kemudian pada komoditas telur dan daging ayam).</w:t>
-      </w:r>
-    </w:p>
-    <w:p>
-      <w:pPr/>
-      <w:r>
-        <w:t xml:space="preserve">• </w:t>
-      </w:r>
-      <w:r>
-        <w:rPr>
-          <w:b/>
-        </w:rPr>
-        <w:t>FASE 3: Machine Learning Multivariat (Q1 2027):</w:t>
-      </w:r>
-      <w:r>
-        <w:t xml:space="preserve"> Integrasi data cuaca curah hujan dari BMKG API, data produksi lokal, serta fluktuasi biaya BBM transportasi ke model ML multivariat (seperti Prophet Multivariat atau XGBoost).</w:t>
-      </w:r>
-    </w:p>
-    <w:p>
-      <w:pPr>
-        <w:pStyle w:val="Heading3"/>
-      </w:pPr>
-      <w:r>
-        <w:t>Tim dan Peran Masing-Masing Anggota</w:t>
-      </w:r>
-    </w:p>
-    <w:p>
-      <w:pPr/>
-      <w:r>
-        <w:t xml:space="preserve">• </w:t>
-      </w:r>
-      <w:r>
-        <w:rPr>
-          <w:b/>
-        </w:rPr>
-        <w:t>Aulia Muzhaffar (ML &amp; Azure Specialist):</w:t>
-      </w:r>
-      <w:r>
-        <w:t xml:space="preserve"> Mengembangkan model Prophet, evaluasi baseline holdout, setup eksperimen MLflow, mendesain serverless pipeline Azure Functions, mengimplementasikan pengujian hipotesis statistik, serta menyusun storytelling analisis.</w:t>
-      </w:r>
-    </w:p>
-    <w:p>
-      <w:pPr/>
-      <w:r>
-        <w:t xml:space="preserve">• </w:t>
-      </w:r>
-      <w:r>
-        <w:rPr>
-          <w:b/>
-        </w:rPr>
-        <w:t>Muhammad Ilhaam Ghiffari (Data Engineer &amp; Frontend Developer):</w:t>
-      </w:r>
-      <w:r>
-        <w:t xml:space="preserve"> Melakukan refactoring modular script ETL, mengembangkan modul deteksi anomali Z-score, mendesain visualisasi dark glassmorphism dashboard, merancang kompresi data JSON, dan mengamankan environment lokal.</w:t>
-      </w:r>
-    </w:p>
-    <w:p>
-      <w:pPr/>
-      <w:r>
-        <w:t xml:space="preserve">• </w:t>
-      </w:r>
-      <w:r>
-        <w:rPr>
-          <w:b/>
-        </w:rPr>
-        <w:t>Arief Hidayah (QA Auditor, Repo Manager &amp; Storyteller):</w:t>
-      </w:r>
-      <w:r>
-        <w:t xml:space="preserve"> Membuat scraper data harian PIHPS, menulis suite pengujian otomatis pytest (74 test cases), menganalisis error model, menyusun bot integrasi notifikasi Telegram, dan mengelola sinkronisasi repositori.</w:t>
-      </w:r>
-    </w:p>
-    <w:p>
-      <w:pPr>
-        <w:pStyle w:val="Heading3"/>
-      </w:pPr>
-      <w:r>
-        <w:t>Kualitas Kode &amp; Penjaminan Mutu (QA)</w:t>
-      </w:r>
-    </w:p>
-    <w:p>
-      <w:pPr/>
-      <w:r>
-        <w:t xml:space="preserve">Repositori ini memiliki </w:t>
-      </w:r>
-      <w:r>
-        <w:rPr>
-          <w:b/>
-        </w:rPr>
-        <w:t>74 unit tests otomatis</w:t>
-      </w:r>
-      <w:r>
-        <w:t xml:space="preserve"> yang mencakup pengujian fungsional dari modul ETL, kalkulasi statistik Z-score, peramalan Prophet, sanitasi JSON, scraper web, notifikasi Telegram, dan evaluasi model baseline. Pengujian dijalankan otomatis via pytest.</w:t>
-      </w:r>
-    </w:p>
-    <w:p>
-      <w:pPr>
-        <w:pStyle w:val="Heading3"/>
-      </w:pPr>
-      <w:r>
-        <w:t>Risiko dan Mitigasi</w:t>
-      </w:r>
-    </w:p>
-    <w:p>
-      <w:pPr/>
-      <w:r>
-        <w:t xml:space="preserve">• </w:t>
-      </w:r>
-      <w:r>
-        <w:rPr>
-          <w:i/>
-        </w:rPr>
-        <w:t>Risiko False Negative:</w:t>
-      </w:r>
-      <w:r>
-        <w:t xml:space="preserve"> Mitigasi dilakukan dengan menetapkan batas Z-score waspada yang cukup sensitif ($2\sigma$) dan selalu menyertakan bayangan area keyakinan prediksi.</w:t>
-      </w:r>
-    </w:p>
-    <w:p>
-      <w:pPr/>
-      <w:r>
-        <w:t xml:space="preserve">• </w:t>
-      </w:r>
-      <w:r>
-        <w:rPr>
-          <w:i/>
-        </w:rPr>
-        <w:t>Risiko Server down pada Sumber Data:</w:t>
-      </w:r>
-      <w:r>
-        <w:t xml:space="preserve"> Azure Functions dilengkapi penanganan pengecualian (</w:t>
-      </w:r>
-      <w:r>
-        <w:rPr>
-          <w:i/>
-        </w:rPr>
         <w:t>error handling</w:t>
       </w:r>
       <w:r>
@@ -5738,7 +5891,9 @@
       </w:r>
     </w:p>
     <w:p>
-      <w:pPr/>
+      <w:pPr>
+        <w:pStyle w:val="ListParagraph"/>
+      </w:pPr>
       <w:r>
         <w:t xml:space="preserve">• </w:t>
       </w:r>

</xml_diff>